<commit_message>
alterando o arquivo word
</commit_message>
<xml_diff>
--- a/Comando_git_versionamento.docx
+++ b/Comando_git_versionamento.docx
@@ -2,16 +2,6 @@
 <file path=word/document.xml><?xml version="1.0" encoding="utf-8"?>
 <w:document xmlns:wpc="http://schemas.microsoft.com/office/word/2010/wordprocessingCanvas" xmlns:cx="http://schemas.microsoft.com/office/drawing/2014/chartex" xmlns:cx1="http://schemas.microsoft.com/office/drawing/2015/9/8/chartex" xmlns:cx2="http://schemas.microsoft.com/office/drawing/2015/10/21/chartex" xmlns:cx3="http://schemas.microsoft.com/office/drawing/2016/5/9/chartex" xmlns:cx4="http://schemas.microsoft.com/office/drawing/2016/5/10/chartex" xmlns:cx5="http://schemas.microsoft.com/office/drawing/2016/5/11/chartex" xmlns:cx6="http://schemas.microsoft.com/office/drawing/2016/5/12/chartex" xmlns:cx7="http://schemas.microsoft.com/office/drawing/2016/5/13/chartex" xmlns:cx8="http://schemas.microsoft.com/office/drawing/2016/5/14/chartex" xmlns:mc="http://schemas.openxmlformats.org/markup-compatibility/2006" xmlns:aink="http://schemas.microsoft.com/office/drawing/2016/ink" xmlns:am3d="http://schemas.microsoft.com/office/drawing/2017/model3d" xmlns:o="urn:schemas-microsoft-com:office:office" xmlns:oel="http://schemas.microsoft.com/office/2019/extlst" xmlns:r="http://schemas.openxmlformats.org/officeDocument/2006/relationships" xmlns:m="http://schemas.openxmlformats.org/officeDocument/2006/math" xmlns:v="urn:schemas-microsoft-com:vml" xmlns:wp14="http://schemas.microsoft.com/office/word/2010/wordprocessingDrawing" xmlns:wp="http://schemas.openxmlformats.org/drawingml/2006/wordprocessingDrawing" xmlns:w10="urn:schemas-microsoft-com:office:word" xmlns:w="http://schemas.openxmlformats.org/wordprocessingml/2006/main" xmlns:w14="http://schemas.microsoft.com/office/word/2010/wordml" xmlns:w15="http://schemas.microsoft.com/office/word/2012/wordml" xmlns:w16cex="http://schemas.microsoft.com/office/word/2018/wordml/cex" xmlns:w16cid="http://schemas.microsoft.com/office/word/2016/wordml/cid" xmlns:w16="http://schemas.microsoft.com/office/word/2018/wordml" xmlns:w16du="http://schemas.microsoft.com/office/word/2023/wordml/word16du" xmlns:w16sdtdh="http://schemas.microsoft.com/office/word/2020/wordml/sdtdatahash" xmlns:w16sdtfl="http://schemas.microsoft.com/office/word/2024/wordml/sdtformatlock" xmlns:w16se="http://schemas.microsoft.com/office/word/2015/wordml/symex" xmlns:wpg="http://schemas.microsoft.com/office/word/2010/wordprocessingGroup" xmlns:wpi="http://schemas.microsoft.com/office/word/2010/wordprocessingInk" xmlns:wne="http://schemas.microsoft.com/office/word/2006/wordml" xmlns:wps="http://schemas.microsoft.com/office/word/2010/wordprocessingShape" mc:Ignorable="w14 w15 w16se w16cid w16 w16cex w16sdtdh w16sdtfl w16du wp14">
   <w:body>
-    <w:p>
-      <w:r>
-        <w:t xml:space="preserve">Curso de Angular na </w:t>
-      </w:r>
-      <w:proofErr w:type="spellStart"/>
-      <w:r>
-        <w:t>Udemy</w:t>
-      </w:r>
-      <w:proofErr w:type="spellEnd"/>
-    </w:p>
     <w:p>
       <w:r>
         <w:t xml:space="preserve">Comandos para versionamento no </w:t>
@@ -457,6 +447,202 @@
         <w:t>adicionar o repositório remoto.</w:t>
       </w:r>
     </w:p>
+    <w:p>
+      <w:r>
+        <w:t>Depois dos comandos iniciais para adicionar a pasta no repositório remoto.</w:t>
+      </w:r>
+    </w:p>
+    <w:p>
+      <w:r>
+        <w:t>Vamos agora criar um novo Branch:</w:t>
+      </w:r>
+    </w:p>
+    <w:p>
+      <w:r>
+        <w:t xml:space="preserve">- </w:t>
+      </w:r>
+      <w:proofErr w:type="spellStart"/>
+      <w:proofErr w:type="gramStart"/>
+      <w:r>
+        <w:t>git</w:t>
+      </w:r>
+      <w:proofErr w:type="spellEnd"/>
+      <w:proofErr w:type="gramEnd"/>
+      <w:r>
+        <w:t xml:space="preserve"> Branch </w:t>
+      </w:r>
+      <w:r>
+        <w:t>NOMEDOBRANCH</w:t>
+      </w:r>
+    </w:p>
+    <w:p>
+      <w:r>
+        <w:t>Agora vamos criar um ou mais arquivos para testar a nova Branch</w:t>
+      </w:r>
+    </w:p>
+    <w:p>
+      <w:r>
+        <w:t>Agora vamos mudar de Branch</w:t>
+      </w:r>
+    </w:p>
+    <w:p>
+      <w:r>
+        <w:t xml:space="preserve">- </w:t>
+      </w:r>
+      <w:proofErr w:type="spellStart"/>
+      <w:proofErr w:type="gramStart"/>
+      <w:r>
+        <w:t>git</w:t>
+      </w:r>
+      <w:proofErr w:type="spellEnd"/>
+      <w:proofErr w:type="gramEnd"/>
+      <w:r>
+        <w:t xml:space="preserve"> checkout NOMEDOBRANCH</w:t>
+      </w:r>
+    </w:p>
+    <w:p>
+      <w:r>
+        <w:t xml:space="preserve">Agora vamos estar dentro da Branch e podemos adicionar os </w:t>
+      </w:r>
+      <w:proofErr w:type="spellStart"/>
+      <w:r>
+        <w:t>arquios</w:t>
+      </w:r>
+      <w:proofErr w:type="spellEnd"/>
+      <w:r>
+        <w:t xml:space="preserve"> e realizar o </w:t>
+      </w:r>
+      <w:proofErr w:type="spellStart"/>
+      <w:r>
+        <w:t>commit</w:t>
+      </w:r>
+      <w:proofErr w:type="spellEnd"/>
+      <w:r>
+        <w:t xml:space="preserve"> dos arquivos</w:t>
+      </w:r>
+    </w:p>
+    <w:p>
+      <w:r>
+        <w:t xml:space="preserve">- </w:t>
+      </w:r>
+      <w:proofErr w:type="spellStart"/>
+      <w:proofErr w:type="gramStart"/>
+      <w:r>
+        <w:t>git</w:t>
+      </w:r>
+      <w:proofErr w:type="spellEnd"/>
+      <w:proofErr w:type="gramEnd"/>
+      <w:r>
+        <w:t xml:space="preserve"> </w:t>
+      </w:r>
+      <w:proofErr w:type="spellStart"/>
+      <w:proofErr w:type="gramStart"/>
+      <w:r>
+        <w:t>add</w:t>
+      </w:r>
+      <w:proofErr w:type="spellEnd"/>
+      <w:r>
+        <w:t xml:space="preserve"> .</w:t>
+      </w:r>
+      <w:proofErr w:type="gramEnd"/>
+    </w:p>
+    <w:p>
+      <w:r>
+        <w:t xml:space="preserve">- </w:t>
+      </w:r>
+      <w:proofErr w:type="spellStart"/>
+      <w:proofErr w:type="gramStart"/>
+      <w:r>
+        <w:t>git</w:t>
+      </w:r>
+      <w:proofErr w:type="spellEnd"/>
+      <w:proofErr w:type="gramEnd"/>
+      <w:r>
+        <w:t xml:space="preserve"> </w:t>
+      </w:r>
+      <w:proofErr w:type="spellStart"/>
+      <w:r>
+        <w:t>commit</w:t>
+      </w:r>
+      <w:proofErr w:type="spellEnd"/>
+      <w:r>
+        <w:t xml:space="preserve"> -</w:t>
+      </w:r>
+      <w:proofErr w:type="spellStart"/>
+      <w:proofErr w:type="gramStart"/>
+      <w:r>
+        <w:t>m”MENSAGEM</w:t>
+      </w:r>
+      <w:proofErr w:type="spellEnd"/>
+      <w:proofErr w:type="gramEnd"/>
+      <w:r>
+        <w:t xml:space="preserve"> DO COMIT”</w:t>
+      </w:r>
+    </w:p>
+    <w:p/>
+    <w:p>
+      <w:r>
+        <w:t>Para vermos em qual Branch estamos basta utilizar o comando</w:t>
+      </w:r>
+    </w:p>
+    <w:p>
+      <w:r>
+        <w:t xml:space="preserve">- </w:t>
+      </w:r>
+      <w:proofErr w:type="spellStart"/>
+      <w:proofErr w:type="gramStart"/>
+      <w:r>
+        <w:t>git</w:t>
+      </w:r>
+      <w:proofErr w:type="spellEnd"/>
+      <w:proofErr w:type="gramEnd"/>
+      <w:r>
+        <w:t xml:space="preserve"> status</w:t>
+      </w:r>
+    </w:p>
+    <w:p>
+      <w:r>
+        <w:t xml:space="preserve">Devemos realizar o </w:t>
+      </w:r>
+      <w:proofErr w:type="spellStart"/>
+      <w:r>
+        <w:t>push</w:t>
+      </w:r>
+      <w:proofErr w:type="spellEnd"/>
+      <w:r>
+        <w:t xml:space="preserve"> das alterações que realizamos </w:t>
+      </w:r>
+    </w:p>
+    <w:p>
+      <w:r>
+        <w:t xml:space="preserve">- </w:t>
+      </w:r>
+      <w:proofErr w:type="spellStart"/>
+      <w:r>
+        <w:t>git</w:t>
+      </w:r>
+      <w:proofErr w:type="spellEnd"/>
+      <w:r>
+        <w:t xml:space="preserve"> </w:t>
+      </w:r>
+      <w:proofErr w:type="spellStart"/>
+      <w:r>
+        <w:t>push</w:t>
+      </w:r>
+      <w:proofErr w:type="spellEnd"/>
+      <w:r>
+        <w:t xml:space="preserve"> -u </w:t>
+      </w:r>
+      <w:proofErr w:type="spellStart"/>
+      <w:r>
+        <w:t>origin</w:t>
+      </w:r>
+      <w:proofErr w:type="spellEnd"/>
+      <w:r>
+        <w:t xml:space="preserve"> BRANCHDESEJADA</w:t>
+      </w:r>
+    </w:p>
+    <w:p/>
     <w:p/>
     <w:sectPr>
       <w:pgSz w:w="11906" w:h="16838"/>
@@ -1896,6 +2082,7 @@
   <w:style w:type="character" w:default="1" w:styleId="Fontepargpadro">
     <w:name w:val="Default Paragraph Font"/>
     <w:uiPriority w:val="1"/>
+    <w:semiHidden/>
     <w:unhideWhenUsed/>
   </w:style>
   <w:style w:type="table" w:default="1" w:styleId="Tabelanormal">

</xml_diff>

<commit_message>
Renomeando o branch e alterando arquivo word
</commit_message>
<xml_diff>
--- a/Comando_git_versionamento.docx
+++ b/Comando_git_versionamento.docx
@@ -383,6 +383,98 @@
       </w:r>
       <w:proofErr w:type="spellEnd"/>
     </w:p>
+    <w:p>
+      <w:pPr>
+        <w:ind w:left="360" w:firstLine="0"/>
+        <w:rPr>
+          <w:b/>
+          <w:bCs/>
+        </w:rPr>
+      </w:pPr>
+      <w:r>
+        <w:rPr>
+          <w:b/>
+          <w:bCs/>
+        </w:rPr>
+        <w:t>Ver a</w:t>
+      </w:r>
+      <w:r>
+        <w:rPr>
+          <w:b/>
+          <w:bCs/>
+        </w:rPr>
+        <w:t xml:space="preserve">s mensagens de </w:t>
+      </w:r>
+      <w:proofErr w:type="spellStart"/>
+      <w:r>
+        <w:rPr>
+          <w:b/>
+          <w:bCs/>
+        </w:rPr>
+        <w:t>commit</w:t>
+      </w:r>
+      <w:proofErr w:type="spellEnd"/>
+    </w:p>
+    <w:p>
+      <w:pPr>
+        <w:ind w:left="360" w:firstLine="0"/>
+      </w:pPr>
+      <w:r>
+        <w:t xml:space="preserve">- </w:t>
+      </w:r>
+      <w:proofErr w:type="spellStart"/>
+      <w:proofErr w:type="gramStart"/>
+      <w:r>
+        <w:t>git</w:t>
+      </w:r>
+      <w:proofErr w:type="spellEnd"/>
+      <w:proofErr w:type="gramEnd"/>
+      <w:r>
+        <w:t xml:space="preserve"> log </w:t>
+      </w:r>
+      <w:r>
+        <w:t>–</w:t>
+      </w:r>
+      <w:proofErr w:type="spellStart"/>
+      <w:r>
+        <w:t>oneline</w:t>
+      </w:r>
+      <w:proofErr w:type="spellEnd"/>
+    </w:p>
+    <w:p>
+      <w:pPr>
+        <w:ind w:left="360" w:firstLine="0"/>
+      </w:pPr>
+    </w:p>
+    <w:p>
+      <w:pPr>
+        <w:ind w:left="360" w:firstLine="0"/>
+        <w:rPr>
+          <w:b/>
+          <w:bCs/>
+        </w:rPr>
+      </w:pPr>
+      <w:r>
+        <w:rPr>
+          <w:b/>
+          <w:bCs/>
+        </w:rPr>
+        <w:t>Voltando ao terminal</w:t>
+      </w:r>
+    </w:p>
+    <w:p>
+      <w:pPr>
+        <w:ind w:left="360" w:firstLine="0"/>
+      </w:pPr>
+      <w:r>
+        <w:t xml:space="preserve">- </w:t>
+      </w:r>
+      <w:proofErr w:type="gramStart"/>
+      <w:r>
+        <w:t>q</w:t>
+      </w:r>
+      <w:proofErr w:type="gramEnd"/>
+    </w:p>
     <w:p/>
     <w:p>
       <w:pPr>
@@ -482,6 +574,7 @@
     </w:p>
     <w:p>
       <w:r>
+        <w:lastRenderedPageBreak/>
         <w:t>Agora vamos mudar de Branch</w:t>
       </w:r>
     </w:p>
@@ -618,10 +711,12 @@
         <w:t xml:space="preserve">- </w:t>
       </w:r>
       <w:proofErr w:type="spellStart"/>
+      <w:proofErr w:type="gramStart"/>
       <w:r>
         <w:t>git</w:t>
       </w:r>
       <w:proofErr w:type="spellEnd"/>
+      <w:proofErr w:type="gramEnd"/>
       <w:r>
         <w:t xml:space="preserve"> </w:t>
       </w:r>
@@ -641,6 +736,1360 @@
       <w:r>
         <w:t xml:space="preserve"> BRANCHDESEJADA</w:t>
       </w:r>
+    </w:p>
+    <w:p>
+      <w:r>
+        <w:t xml:space="preserve">Vendo as </w:t>
+      </w:r>
+      <w:proofErr w:type="spellStart"/>
+      <w:r>
+        <w:t>branches</w:t>
+      </w:r>
+      <w:proofErr w:type="spellEnd"/>
+      <w:r>
+        <w:t xml:space="preserve"> do projeto</w:t>
+      </w:r>
+    </w:p>
+    <w:p>
+      <w:r>
+        <w:t xml:space="preserve">- </w:t>
+      </w:r>
+      <w:proofErr w:type="spellStart"/>
+      <w:r>
+        <w:t>git</w:t>
+      </w:r>
+      <w:proofErr w:type="spellEnd"/>
+      <w:r>
+        <w:t xml:space="preserve"> </w:t>
+      </w:r>
+      <w:proofErr w:type="spellStart"/>
+      <w:r>
+        <w:t>branch</w:t>
+      </w:r>
+      <w:proofErr w:type="spellEnd"/>
+    </w:p>
+    <w:p>
+      <w:pPr>
+        <w:numPr>
+          <w:ilvl w:val="0"/>
+          <w:numId w:val="8"/>
+        </w:numPr>
+        <w:tabs>
+          <w:tab w:val="clear" w:pos="720"/>
+        </w:tabs>
+        <w:rPr>
+          <w:b/>
+          <w:bCs/>
+        </w:rPr>
+      </w:pPr>
+      <w:hyperlink r:id="rId5" w:tgtFrame="_blank" w:history="1">
+        <w:r>
+          <w:rPr>
+            <w:rStyle w:val="Hyperlink"/>
+            <w:b/>
+            <w:bCs/>
+          </w:rPr>
+          <w:t xml:space="preserve">Clonar Branch Específico no </w:t>
+        </w:r>
+        <w:proofErr w:type="spellStart"/>
+        <w:r>
+          <w:rPr>
+            <w:rStyle w:val="Hyperlink"/>
+            <w:b/>
+            <w:bCs/>
+          </w:rPr>
+          <w:t>Git</w:t>
+        </w:r>
+        <w:proofErr w:type="spellEnd"/>
+      </w:hyperlink>
+    </w:p>
+    <w:p>
+      <w:hyperlink r:id="rId6" w:tgtFrame="_blank" w:history="1">
+        <w:r>
+          <w:rPr>
+            <w:rStyle w:val="Hyperlink"/>
+            <w:b/>
+            <w:bCs/>
+            <w:vertAlign w:val="superscript"/>
+          </w:rPr>
+          <w:t>1</w:t>
+        </w:r>
+      </w:hyperlink>
+      <w:hyperlink r:id="rId7" w:tgtFrame="_blank" w:history="1">
+        <w:r>
+          <w:rPr>
+            <w:rStyle w:val="Hyperlink"/>
+            <w:b/>
+            <w:bCs/>
+            <w:vertAlign w:val="superscript"/>
+          </w:rPr>
+          <w:t>2</w:t>
+        </w:r>
+      </w:hyperlink>
+    </w:p>
+    <w:p>
+      <w:pPr>
+        <w:rPr>
+          <w:rStyle w:val="Hyperlink"/>
+        </w:rPr>
+      </w:pPr>
+      <w:r>
+        <w:fldChar w:fldCharType="begin"/>
+      </w:r>
+      <w:r>
+        <w:instrText>HYPERLINK "https://www.bing.com/ck/a?!&amp;&amp;p=f72a4eb499f54363d80b788b87ce211145ff93752f3d80ebc15b87b97748d36fJmltdHM9MTc1NzQ2MjQwMA&amp;ptn=3&amp;ver=2&amp;hsh=4&amp;fclid=06420d19-debe-66b2-1a37-184edfe967ca&amp;psq=como+clonar+somente+um+branch+no+git&amp;u=a1aHR0cHM6Ly93d3cuZnJlZWNvZGVjYW1wLm9yZy9wb3J0dWd1ZXNlL25ld3MvZ2l0LWNsb25lLWJyYW5jaC1jb21vLWNsb25hci11bS1icmFuY2gtZXNwZWNpZmljby8&amp;ntb=1" \t "_blank"</w:instrText>
+      </w:r>
+      <w:r>
+        <w:fldChar w:fldCharType="separate"/>
+      </w:r>
+    </w:p>
+    <w:p>
+      <w:pPr>
+        <w:numPr>
+          <w:ilvl w:val="0"/>
+          <w:numId w:val="8"/>
+        </w:numPr>
+        <w:tabs>
+          <w:tab w:val="clear" w:pos="720"/>
+        </w:tabs>
+        <w:rPr>
+          <w:rStyle w:val="Hyperlink"/>
+          <w:b/>
+          <w:bCs/>
+        </w:rPr>
+      </w:pPr>
+      <w:proofErr w:type="spellStart"/>
+      <w:r>
+        <w:rPr>
+          <w:rStyle w:val="Hyperlink"/>
+          <w:b/>
+          <w:bCs/>
+        </w:rPr>
+        <w:t>Git</w:t>
+      </w:r>
+      <w:proofErr w:type="spellEnd"/>
+      <w:r>
+        <w:rPr>
+          <w:rStyle w:val="Hyperlink"/>
+          <w:b/>
+          <w:bCs/>
+        </w:rPr>
+        <w:t xml:space="preserve"> Clone Branch – Como clonar um </w:t>
+      </w:r>
+      <w:proofErr w:type="spellStart"/>
+      <w:r>
+        <w:rPr>
+          <w:rStyle w:val="Hyperlink"/>
+          <w:b/>
+          <w:bCs/>
+        </w:rPr>
+        <w:t>branch</w:t>
+      </w:r>
+      <w:proofErr w:type="spellEnd"/>
+      <w:r>
+        <w:rPr>
+          <w:rStyle w:val="Hyperlink"/>
+          <w:b/>
+          <w:bCs/>
+        </w:rPr>
+        <w:t xml:space="preserve"> específico</w:t>
+      </w:r>
+    </w:p>
+    <w:p>
+      <w:pPr>
+        <w:rPr>
+          <w:rStyle w:val="Hyperlink"/>
+        </w:rPr>
+      </w:pPr>
+      <w:r>
+        <w:rPr>
+          <w:rStyle w:val="Hyperlink"/>
+        </w:rPr>
+        <w:t>https://www.freecodecamp.org/portuguese/news/git-clone-branch-como-clonar-um-branch-especifico/</w:t>
+      </w:r>
+    </w:p>
+    <w:p>
+      <w:r>
+        <w:fldChar w:fldCharType="end"/>
+      </w:r>
+    </w:p>
+    <w:p>
+      <w:pPr>
+        <w:rPr>
+          <w:rStyle w:val="Hyperlink"/>
+        </w:rPr>
+      </w:pPr>
+      <w:r>
+        <w:fldChar w:fldCharType="begin"/>
+      </w:r>
+      <w:r>
+        <w:instrText>HYPERLINK "https://www.bing.com/ck/a?!&amp;&amp;p=5e7d120e58480662aa39f14a1cfa8f0365a0d418f8d58739279a857767952b71JmltdHM9MTc1NzQ2MjQwMA&amp;ptn=3&amp;ver=2&amp;hsh=4&amp;fclid=06420d19-debe-66b2-1a37-184edfe967ca&amp;psq=como+clonar+somente+um+branch+no+git&amp;u=a1aHR0cHM6Ly9zdGFja292ZXJmbG93LmNvbS9xdWVzdGlvbnMvMTkxMTEwOS9ob3ctZG8taS1jbG9uZS1hLXNwZWNpZmljLWdpdC1icmFuY2g&amp;ntb=1" \t "_blank"</w:instrText>
+      </w:r>
+      <w:r>
+        <w:fldChar w:fldCharType="separate"/>
+      </w:r>
+    </w:p>
+    <w:p>
+      <w:pPr>
+        <w:numPr>
+          <w:ilvl w:val="0"/>
+          <w:numId w:val="8"/>
+        </w:numPr>
+        <w:tabs>
+          <w:tab w:val="clear" w:pos="720"/>
+        </w:tabs>
+        <w:rPr>
+          <w:rStyle w:val="Hyperlink"/>
+          <w:b/>
+          <w:bCs/>
+        </w:rPr>
+      </w:pPr>
+      <w:proofErr w:type="spellStart"/>
+      <w:r>
+        <w:rPr>
+          <w:rStyle w:val="Hyperlink"/>
+          <w:b/>
+          <w:bCs/>
+        </w:rPr>
+        <w:t>How</w:t>
+      </w:r>
+      <w:proofErr w:type="spellEnd"/>
+      <w:r>
+        <w:rPr>
+          <w:rStyle w:val="Hyperlink"/>
+          <w:b/>
+          <w:bCs/>
+        </w:rPr>
+        <w:t xml:space="preserve"> do I clone a </w:t>
+      </w:r>
+      <w:proofErr w:type="spellStart"/>
+      <w:r>
+        <w:rPr>
+          <w:rStyle w:val="Hyperlink"/>
+          <w:b/>
+          <w:bCs/>
+        </w:rPr>
+        <w:t>specific</w:t>
+      </w:r>
+      <w:proofErr w:type="spellEnd"/>
+      <w:r>
+        <w:rPr>
+          <w:rStyle w:val="Hyperlink"/>
+          <w:b/>
+          <w:bCs/>
+        </w:rPr>
+        <w:t xml:space="preserve"> </w:t>
+      </w:r>
+      <w:proofErr w:type="spellStart"/>
+      <w:r>
+        <w:rPr>
+          <w:rStyle w:val="Hyperlink"/>
+          <w:b/>
+          <w:bCs/>
+        </w:rPr>
+        <w:t>Git</w:t>
+      </w:r>
+      <w:proofErr w:type="spellEnd"/>
+      <w:r>
+        <w:rPr>
+          <w:rStyle w:val="Hyperlink"/>
+          <w:b/>
+          <w:bCs/>
+        </w:rPr>
+        <w:t xml:space="preserve"> </w:t>
+      </w:r>
+      <w:proofErr w:type="spellStart"/>
+      <w:r>
+        <w:rPr>
+          <w:rStyle w:val="Hyperlink"/>
+          <w:b/>
+          <w:bCs/>
+        </w:rPr>
+        <w:t>branch</w:t>
+      </w:r>
+      <w:proofErr w:type="spellEnd"/>
+      <w:r>
+        <w:rPr>
+          <w:rStyle w:val="Hyperlink"/>
+          <w:b/>
+          <w:bCs/>
+        </w:rPr>
+        <w:t>? - Stack Overflow</w:t>
+      </w:r>
+    </w:p>
+    <w:p>
+      <w:pPr>
+        <w:rPr>
+          <w:rStyle w:val="Hyperlink"/>
+        </w:rPr>
+      </w:pPr>
+      <w:r>
+        <w:rPr>
+          <w:rStyle w:val="Hyperlink"/>
+        </w:rPr>
+        <w:t>https://stackoverflow.com/questions/1911109/how-do-i-clone-a-specific-git-branch</w:t>
+      </w:r>
+    </w:p>
+    <w:p>
+      <w:r>
+        <w:fldChar w:fldCharType="end"/>
+      </w:r>
+    </w:p>
+    <w:p>
+      <w:r>
+        <w:t xml:space="preserve">Clonar um </w:t>
+      </w:r>
+      <w:proofErr w:type="spellStart"/>
+      <w:r>
+        <w:t>branch</w:t>
+      </w:r>
+      <w:proofErr w:type="spellEnd"/>
+      <w:r>
+        <w:t xml:space="preserve"> específico no </w:t>
+      </w:r>
+      <w:proofErr w:type="spellStart"/>
+      <w:r>
+        <w:t>Git</w:t>
+      </w:r>
+      <w:proofErr w:type="spellEnd"/>
+      <w:r>
+        <w:t xml:space="preserve"> é útil quando você deseja trabalhar apenas em uma parte do repositório, economizando tempo e espaço. Existem duas maneiras principais de fazer isso.</w:t>
+      </w:r>
+    </w:p>
+    <w:p>
+      <w:pPr>
+        <w:rPr>
+          <w:b/>
+          <w:bCs/>
+        </w:rPr>
+      </w:pPr>
+      <w:r>
+        <w:rPr>
+          <w:b/>
+          <w:bCs/>
+        </w:rPr>
+        <w:t>Método 1: Clonar Apenas o Branch Específico</w:t>
+      </w:r>
+    </w:p>
+    <w:p>
+      <w:r>
+        <w:t xml:space="preserve">Este método baixa apenas o </w:t>
+      </w:r>
+      <w:proofErr w:type="spellStart"/>
+      <w:r>
+        <w:t>branch</w:t>
+      </w:r>
+      <w:proofErr w:type="spellEnd"/>
+      <w:r>
+        <w:t xml:space="preserve"> desejado, sem trazer os outros </w:t>
+      </w:r>
+      <w:proofErr w:type="spellStart"/>
+      <w:r>
+        <w:t>branches</w:t>
+      </w:r>
+      <w:proofErr w:type="spellEnd"/>
+      <w:r>
+        <w:t xml:space="preserve"> do repositório.</w:t>
+      </w:r>
+    </w:p>
+    <w:p>
+      <w:r>
+        <w:rPr>
+          <w:b/>
+          <w:bCs/>
+        </w:rPr>
+        <w:t>Passos:</w:t>
+      </w:r>
+    </w:p>
+    <w:p>
+      <w:pPr>
+        <w:numPr>
+          <w:ilvl w:val="0"/>
+          <w:numId w:val="7"/>
+        </w:numPr>
+      </w:pPr>
+      <w:r>
+        <w:t xml:space="preserve">Use o comando abaixo para clonar o </w:t>
+      </w:r>
+      <w:proofErr w:type="spellStart"/>
+      <w:r>
+        <w:t>branch</w:t>
+      </w:r>
+      <w:proofErr w:type="spellEnd"/>
+      <w:r>
+        <w:t xml:space="preserve"> específico: </w:t>
+      </w:r>
+      <w:proofErr w:type="spellStart"/>
+      <w:r>
+        <w:t>git</w:t>
+      </w:r>
+      <w:proofErr w:type="spellEnd"/>
+      <w:r>
+        <w:t xml:space="preserve"> clone --</w:t>
+      </w:r>
+      <w:proofErr w:type="spellStart"/>
+      <w:r>
+        <w:t>branch</w:t>
+      </w:r>
+      <w:proofErr w:type="spellEnd"/>
+      <w:r>
+        <w:t xml:space="preserve"> &lt;nome-do-</w:t>
+      </w:r>
+      <w:proofErr w:type="spellStart"/>
+      <w:r>
+        <w:t>branch</w:t>
+      </w:r>
+      <w:proofErr w:type="spellEnd"/>
+      <w:r>
+        <w:t>&gt; --single-</w:t>
+      </w:r>
+      <w:proofErr w:type="spellStart"/>
+      <w:r>
+        <w:t>branch</w:t>
+      </w:r>
+      <w:proofErr w:type="spellEnd"/>
+      <w:r>
+        <w:t xml:space="preserve"> &lt;</w:t>
+      </w:r>
+      <w:proofErr w:type="spellStart"/>
+      <w:r>
+        <w:t>url</w:t>
+      </w:r>
+      <w:proofErr w:type="spellEnd"/>
+      <w:r>
+        <w:t>-do-</w:t>
+      </w:r>
+      <w:proofErr w:type="spellStart"/>
+      <w:r>
+        <w:t>repositorio</w:t>
+      </w:r>
+      <w:proofErr w:type="spellEnd"/>
+      <w:r>
+        <w:t>&gt; Substitua &lt;nome-do-</w:t>
+      </w:r>
+      <w:proofErr w:type="spellStart"/>
+      <w:r>
+        <w:t>branch</w:t>
+      </w:r>
+      <w:proofErr w:type="spellEnd"/>
+      <w:r>
+        <w:t xml:space="preserve">&gt; pelo nome do </w:t>
+      </w:r>
+      <w:proofErr w:type="spellStart"/>
+      <w:r>
+        <w:t>branch</w:t>
+      </w:r>
+      <w:proofErr w:type="spellEnd"/>
+      <w:r>
+        <w:t xml:space="preserve"> que deseja clonar. Substitua &lt;</w:t>
+      </w:r>
+      <w:proofErr w:type="spellStart"/>
+      <w:r>
+        <w:t>url</w:t>
+      </w:r>
+      <w:proofErr w:type="spellEnd"/>
+      <w:r>
+        <w:t>-do-</w:t>
+      </w:r>
+      <w:proofErr w:type="spellStart"/>
+      <w:r>
+        <w:t>repositorio</w:t>
+      </w:r>
+      <w:proofErr w:type="spellEnd"/>
+      <w:r>
+        <w:t>&gt; pela URL do repositório remoto.</w:t>
+      </w:r>
+    </w:p>
+    <w:p>
+      <w:r>
+        <w:rPr>
+          <w:b/>
+          <w:bCs/>
+        </w:rPr>
+        <w:lastRenderedPageBreak/>
+        <w:t>Exemplo:</w:t>
+      </w:r>
+    </w:p>
+    <w:p>
+      <w:proofErr w:type="spellStart"/>
+      <w:r>
+        <w:t>git</w:t>
+      </w:r>
+      <w:proofErr w:type="spellEnd"/>
+      <w:r>
+        <w:t xml:space="preserve"> clone --</w:t>
+      </w:r>
+      <w:proofErr w:type="spellStart"/>
+      <w:r>
+        <w:t>branch</w:t>
+      </w:r>
+      <w:proofErr w:type="spellEnd"/>
+      <w:r>
+        <w:t xml:space="preserve"> feature-login --single-</w:t>
+      </w:r>
+      <w:proofErr w:type="spellStart"/>
+      <w:r>
+        <w:t>branch</w:t>
+      </w:r>
+      <w:proofErr w:type="spellEnd"/>
+      <w:r>
+        <w:t xml:space="preserve"> https://github.com/usuario/projeto.git</w:t>
+      </w:r>
+    </w:p>
+    <w:p>
+      <w:r>
+        <w:t xml:space="preserve">Isso clona apenas o </w:t>
+      </w:r>
+      <w:proofErr w:type="spellStart"/>
+      <w:r>
+        <w:t>branch</w:t>
+      </w:r>
+      <w:proofErr w:type="spellEnd"/>
+      <w:r>
+        <w:t> feature-login e ignora os demais.</w:t>
+      </w:r>
+    </w:p>
+    <w:p>
+      <w:pPr>
+        <w:rPr>
+          <w:b/>
+          <w:bCs/>
+        </w:rPr>
+      </w:pPr>
+      <w:r>
+        <w:rPr>
+          <w:b/>
+          <w:bCs/>
+        </w:rPr>
+        <w:t>Método 2: Clonar Todo o Repositório e Fazer Checkout do Branch</w:t>
+      </w:r>
+    </w:p>
+    <w:p>
+      <w:r>
+        <w:t xml:space="preserve">Se você já clonou o repositório completo ou precisa de acesso a outros </w:t>
+      </w:r>
+      <w:proofErr w:type="spellStart"/>
+      <w:r>
+        <w:t>branches</w:t>
+      </w:r>
+      <w:proofErr w:type="spellEnd"/>
+      <w:r>
+        <w:t xml:space="preserve">, pode alternar para um </w:t>
+      </w:r>
+      <w:proofErr w:type="spellStart"/>
+      <w:r>
+        <w:t>branch</w:t>
+      </w:r>
+      <w:proofErr w:type="spellEnd"/>
+      <w:r>
+        <w:t xml:space="preserve"> específico.</w:t>
+      </w:r>
+    </w:p>
+    <w:p>
+      <w:r>
+        <w:rPr>
+          <w:b/>
+          <w:bCs/>
+        </w:rPr>
+        <w:t>Passos:</w:t>
+      </w:r>
+    </w:p>
+    <w:p>
+      <w:pPr>
+        <w:numPr>
+          <w:ilvl w:val="0"/>
+          <w:numId w:val="8"/>
+        </w:numPr>
+      </w:pPr>
+      <w:r>
+        <w:t>Clone o repositório normalmente:</w:t>
+      </w:r>
+    </w:p>
+    <w:p>
+      <w:proofErr w:type="spellStart"/>
+      <w:r>
+        <w:t>git</w:t>
+      </w:r>
+      <w:proofErr w:type="spellEnd"/>
+      <w:r>
+        <w:t xml:space="preserve"> clone &lt;</w:t>
+      </w:r>
+      <w:proofErr w:type="spellStart"/>
+      <w:r>
+        <w:t>url</w:t>
+      </w:r>
+      <w:proofErr w:type="spellEnd"/>
+      <w:r>
+        <w:t>-do-</w:t>
+      </w:r>
+      <w:proofErr w:type="spellStart"/>
+      <w:r>
+        <w:t>repositorio</w:t>
+      </w:r>
+      <w:proofErr w:type="spellEnd"/>
+      <w:r>
+        <w:t>&gt;</w:t>
+      </w:r>
+    </w:p>
+    <w:p>
+      <w:pPr>
+        <w:numPr>
+          <w:ilvl w:val="0"/>
+          <w:numId w:val="9"/>
+        </w:numPr>
+      </w:pPr>
+      <w:r>
+        <w:t xml:space="preserve">Liste os </w:t>
+      </w:r>
+      <w:proofErr w:type="spellStart"/>
+      <w:r>
+        <w:t>branches</w:t>
+      </w:r>
+      <w:proofErr w:type="spellEnd"/>
+      <w:r>
+        <w:t xml:space="preserve"> disponíveis:</w:t>
+      </w:r>
+    </w:p>
+    <w:p>
+      <w:proofErr w:type="spellStart"/>
+      <w:r>
+        <w:t>git</w:t>
+      </w:r>
+      <w:proofErr w:type="spellEnd"/>
+      <w:r>
+        <w:t xml:space="preserve"> </w:t>
+      </w:r>
+      <w:proofErr w:type="spellStart"/>
+      <w:r>
+        <w:t>branch</w:t>
+      </w:r>
+      <w:proofErr w:type="spellEnd"/>
+      <w:r>
+        <w:t xml:space="preserve"> -a</w:t>
+      </w:r>
+    </w:p>
+    <w:p>
+      <w:pPr>
+        <w:numPr>
+          <w:ilvl w:val="0"/>
+          <w:numId w:val="10"/>
+        </w:numPr>
+      </w:pPr>
+      <w:r>
+        <w:t xml:space="preserve">Faça checkout no </w:t>
+      </w:r>
+      <w:proofErr w:type="spellStart"/>
+      <w:r>
+        <w:t>branch</w:t>
+      </w:r>
+      <w:proofErr w:type="spellEnd"/>
+      <w:r>
+        <w:t xml:space="preserve"> desejado:</w:t>
+      </w:r>
+    </w:p>
+    <w:p>
+      <w:proofErr w:type="spellStart"/>
+      <w:r>
+        <w:t>git</w:t>
+      </w:r>
+      <w:proofErr w:type="spellEnd"/>
+      <w:r>
+        <w:t xml:space="preserve"> checkout &lt;nome-do-</w:t>
+      </w:r>
+      <w:proofErr w:type="spellStart"/>
+      <w:r>
+        <w:t>branch</w:t>
+      </w:r>
+      <w:proofErr w:type="spellEnd"/>
+      <w:r>
+        <w:t>&gt;</w:t>
+      </w:r>
+    </w:p>
+    <w:p>
+      <w:r>
+        <w:rPr>
+          <w:b/>
+          <w:bCs/>
+        </w:rPr>
+        <w:t>Exemplo:</w:t>
+      </w:r>
+    </w:p>
+    <w:p>
+      <w:proofErr w:type="spellStart"/>
+      <w:r>
+        <w:t>git</w:t>
+      </w:r>
+      <w:proofErr w:type="spellEnd"/>
+      <w:r>
+        <w:t xml:space="preserve"> clone https://github.com/usuario/projeto.git</w:t>
+      </w:r>
+    </w:p>
+    <w:p>
+      <w:proofErr w:type="spellStart"/>
+      <w:r>
+        <w:t>cd</w:t>
+      </w:r>
+      <w:proofErr w:type="spellEnd"/>
+      <w:r>
+        <w:t> projeto</w:t>
+      </w:r>
+    </w:p>
+    <w:p>
+      <w:proofErr w:type="spellStart"/>
+      <w:r>
+        <w:t>git</w:t>
+      </w:r>
+      <w:proofErr w:type="spellEnd"/>
+      <w:r>
+        <w:t xml:space="preserve"> checkout feature-login</w:t>
+      </w:r>
+    </w:p>
+    <w:p>
+      <w:pPr>
+        <w:rPr>
+          <w:b/>
+          <w:bCs/>
+        </w:rPr>
+      </w:pPr>
+      <w:r>
+        <w:rPr>
+          <w:b/>
+          <w:bCs/>
+        </w:rPr>
+        <w:t>Dicas e Boas Práticas</w:t>
+      </w:r>
+    </w:p>
+    <w:p>
+      <w:pPr>
+        <w:numPr>
+          <w:ilvl w:val="0"/>
+          <w:numId w:val="11"/>
+        </w:numPr>
+      </w:pPr>
+      <w:r>
+        <w:t>Use --</w:t>
+      </w:r>
+      <w:proofErr w:type="spellStart"/>
+      <w:r>
+        <w:t>depth</w:t>
+      </w:r>
+      <w:proofErr w:type="spellEnd"/>
+      <w:r>
+        <w:t>=1 junto com --single-</w:t>
+      </w:r>
+      <w:proofErr w:type="spellStart"/>
+      <w:r>
+        <w:t>branch</w:t>
+      </w:r>
+      <w:proofErr w:type="spellEnd"/>
+      <w:r>
+        <w:t> para criar um clone raso (</w:t>
+      </w:r>
+      <w:proofErr w:type="spellStart"/>
+      <w:r>
+        <w:t>shallow</w:t>
+      </w:r>
+      <w:proofErr w:type="spellEnd"/>
+      <w:r>
+        <w:t xml:space="preserve"> clone), reduzindo ainda mais o tamanho do download:</w:t>
+      </w:r>
+    </w:p>
+    <w:p>
+      <w:proofErr w:type="spellStart"/>
+      <w:r>
+        <w:t>git</w:t>
+      </w:r>
+      <w:proofErr w:type="spellEnd"/>
+      <w:r>
+        <w:t xml:space="preserve"> clone --</w:t>
+      </w:r>
+      <w:proofErr w:type="spellStart"/>
+      <w:r>
+        <w:t>branch</w:t>
+      </w:r>
+      <w:proofErr w:type="spellEnd"/>
+      <w:r>
+        <w:t xml:space="preserve"> &lt;nome-do-</w:t>
+      </w:r>
+      <w:proofErr w:type="spellStart"/>
+      <w:r>
+        <w:t>branch</w:t>
+      </w:r>
+      <w:proofErr w:type="spellEnd"/>
+      <w:r>
+        <w:t>&gt; --single-</w:t>
+      </w:r>
+      <w:proofErr w:type="spellStart"/>
+      <w:r>
+        <w:t>branch</w:t>
+      </w:r>
+      <w:proofErr w:type="spellEnd"/>
+      <w:r>
+        <w:t xml:space="preserve"> --</w:t>
+      </w:r>
+      <w:proofErr w:type="spellStart"/>
+      <w:r>
+        <w:t>depth</w:t>
+      </w:r>
+      <w:proofErr w:type="spellEnd"/>
+      <w:r>
+        <w:t>=1 &lt;</w:t>
+      </w:r>
+      <w:proofErr w:type="spellStart"/>
+      <w:r>
+        <w:t>url</w:t>
+      </w:r>
+      <w:proofErr w:type="spellEnd"/>
+      <w:r>
+        <w:t>-do-</w:t>
+      </w:r>
+      <w:proofErr w:type="spellStart"/>
+      <w:r>
+        <w:t>repositorio</w:t>
+      </w:r>
+      <w:proofErr w:type="spellEnd"/>
+      <w:r>
+        <w:t>&gt;</w:t>
+      </w:r>
+    </w:p>
+    <w:p>
+      <w:pPr>
+        <w:numPr>
+          <w:ilvl w:val="0"/>
+          <w:numId w:val="12"/>
+        </w:numPr>
+      </w:pPr>
+      <w:r>
+        <w:t xml:space="preserve">Certifique-se de que o nome do </w:t>
+      </w:r>
+      <w:proofErr w:type="spellStart"/>
+      <w:r>
+        <w:t>branch</w:t>
+      </w:r>
+      <w:proofErr w:type="spellEnd"/>
+      <w:r>
+        <w:t xml:space="preserve"> está correto, especialmente se for sensível a maiúsculas e minúsculas.</w:t>
+      </w:r>
+    </w:p>
+    <w:p>
+      <w:pPr>
+        <w:numPr>
+          <w:ilvl w:val="0"/>
+          <w:numId w:val="13"/>
+        </w:numPr>
+      </w:pPr>
+      <w:r>
+        <w:t>Utilize </w:t>
+      </w:r>
+      <w:proofErr w:type="spellStart"/>
+      <w:r>
+        <w:t>git</w:t>
+      </w:r>
+      <w:proofErr w:type="spellEnd"/>
+      <w:r>
+        <w:t xml:space="preserve"> </w:t>
+      </w:r>
+      <w:proofErr w:type="spellStart"/>
+      <w:r>
+        <w:t>fetch</w:t>
+      </w:r>
+      <w:proofErr w:type="spellEnd"/>
+      <w:r>
+        <w:t xml:space="preserve"> para atualizar </w:t>
+      </w:r>
+      <w:proofErr w:type="spellStart"/>
+      <w:r>
+        <w:t>branches</w:t>
+      </w:r>
+      <w:proofErr w:type="spellEnd"/>
+      <w:r>
+        <w:t xml:space="preserve"> remotos antes de alternar entre eles, caso necessário.</w:t>
+      </w:r>
+    </w:p>
+    <w:p>
+      <w:r>
+        <w:t xml:space="preserve">Esses métodos garantem flexibilidade ao trabalhar com </w:t>
+      </w:r>
+      <w:proofErr w:type="spellStart"/>
+      <w:r>
+        <w:t>branches</w:t>
+      </w:r>
+      <w:proofErr w:type="spellEnd"/>
+      <w:r>
+        <w:t xml:space="preserve"> específicos no </w:t>
+      </w:r>
+      <w:proofErr w:type="spellStart"/>
+      <w:r>
+        <w:t>Git</w:t>
+      </w:r>
+      <w:proofErr w:type="spellEnd"/>
+      <w:r>
+        <w:t>.</w:t>
+      </w:r>
+    </w:p>
+    <w:p>
+      <w:r>
+        <w:t>Saiba mais:</w:t>
+      </w:r>
+    </w:p>
+    <w:p>
+      <w:hyperlink r:id="rId8" w:tgtFrame="_blank" w:history="1">
+        <w:r>
+          <w:rPr>
+            <w:rStyle w:val="Hyperlink"/>
+            <w:b/>
+            <w:bCs/>
+          </w:rPr>
+          <w:t>1 -</w:t>
+        </w:r>
+        <w:r>
+          <w:rPr>
+            <w:rStyle w:val="Hyperlink"/>
+          </w:rPr>
+          <w:t>freecodecamp.org</w:t>
+        </w:r>
+      </w:hyperlink>
+      <w:hyperlink r:id="rId9" w:tgtFrame="_blank" w:history="1">
+        <w:r>
+          <w:rPr>
+            <w:rStyle w:val="Hyperlink"/>
+            <w:b/>
+            <w:bCs/>
+          </w:rPr>
+          <w:t>2 -</w:t>
+        </w:r>
+        <w:r>
+          <w:rPr>
+            <w:rStyle w:val="Hyperlink"/>
+          </w:rPr>
+          <w:t>stackoverflow.com</w:t>
+        </w:r>
+      </w:hyperlink>
+    </w:p>
+    <w:p/>
+    <w:p>
+      <w:pPr>
+        <w:rPr>
+          <w:b/>
+          <w:bCs/>
+        </w:rPr>
+      </w:pPr>
+    </w:p>
+    <w:p>
+      <w:pPr>
+        <w:rPr>
+          <w:b/>
+          <w:bCs/>
+        </w:rPr>
+      </w:pPr>
+    </w:p>
+    <w:p>
+      <w:pPr>
+        <w:rPr>
+          <w:b/>
+          <w:bCs/>
+        </w:rPr>
+      </w:pPr>
+    </w:p>
+    <w:p>
+      <w:pPr>
+        <w:rPr>
+          <w:b/>
+          <w:bCs/>
+        </w:rPr>
+      </w:pPr>
+      <w:r>
+        <w:rPr>
+          <w:b/>
+          <w:bCs/>
+        </w:rPr>
+        <w:lastRenderedPageBreak/>
+        <w:t xml:space="preserve">Deletando um Branch </w:t>
+      </w:r>
+    </w:p>
+    <w:p>
+      <w:r>
+        <w:t xml:space="preserve">- </w:t>
+      </w:r>
+      <w:proofErr w:type="spellStart"/>
+      <w:proofErr w:type="gramStart"/>
+      <w:r>
+        <w:t>git</w:t>
+      </w:r>
+      <w:proofErr w:type="spellEnd"/>
+      <w:proofErr w:type="gramEnd"/>
+      <w:r>
+        <w:t xml:space="preserve"> Branch -d NOME-DO-BRANCH</w:t>
+      </w:r>
+    </w:p>
+    <w:p>
+      <w:pPr>
+        <w:rPr>
+          <w:b/>
+          <w:bCs/>
+        </w:rPr>
+      </w:pPr>
+      <w:r>
+        <w:rPr>
+          <w:b/>
+          <w:bCs/>
+        </w:rPr>
+        <w:t xml:space="preserve">Como renomear um Branch </w:t>
+      </w:r>
+    </w:p>
+    <w:p>
+      <w:pPr>
+        <w:pStyle w:val="PargrafodaLista"/>
+        <w:numPr>
+          <w:ilvl w:val="0"/>
+          <w:numId w:val="14"/>
+        </w:numPr>
+        <w:rPr>
+          <w:b/>
+          <w:bCs/>
+        </w:rPr>
+      </w:pPr>
+      <w:r>
+        <w:rPr>
+          <w:b/>
+          <w:bCs/>
+        </w:rPr>
+        <w:t xml:space="preserve">Troque para o </w:t>
+      </w:r>
+      <w:proofErr w:type="spellStart"/>
+      <w:r>
+        <w:rPr>
+          <w:b/>
+          <w:bCs/>
+        </w:rPr>
+        <w:t>branch</w:t>
+      </w:r>
+      <w:proofErr w:type="spellEnd"/>
+      <w:r>
+        <w:rPr>
+          <w:b/>
+          <w:bCs/>
+        </w:rPr>
+        <w:t xml:space="preserve"> que deseja renomear (se ainda não estiver nele):</w:t>
+      </w:r>
+    </w:p>
+    <w:p>
+      <w:proofErr w:type="spellStart"/>
+      <w:r>
+        <w:t>git</w:t>
+      </w:r>
+      <w:proofErr w:type="spellEnd"/>
+      <w:r>
+        <w:t xml:space="preserve"> checkout nome-antigo</w:t>
+      </w:r>
+    </w:p>
+    <w:p>
+      <w:pPr>
+        <w:pStyle w:val="PargrafodaLista"/>
+        <w:numPr>
+          <w:ilvl w:val="0"/>
+          <w:numId w:val="14"/>
+        </w:numPr>
+        <w:rPr>
+          <w:b/>
+          <w:bCs/>
+        </w:rPr>
+      </w:pPr>
+      <w:r>
+        <w:rPr>
+          <w:b/>
+          <w:bCs/>
+        </w:rPr>
+        <w:t xml:space="preserve">Renomeie o </w:t>
+      </w:r>
+      <w:proofErr w:type="spellStart"/>
+      <w:r>
+        <w:rPr>
+          <w:b/>
+          <w:bCs/>
+        </w:rPr>
+        <w:t>branch</w:t>
+      </w:r>
+      <w:proofErr w:type="spellEnd"/>
+      <w:r>
+        <w:rPr>
+          <w:b/>
+          <w:bCs/>
+        </w:rPr>
+        <w:t xml:space="preserve"> localmente:</w:t>
+      </w:r>
+    </w:p>
+    <w:p>
+      <w:proofErr w:type="spellStart"/>
+      <w:r>
+        <w:t>git</w:t>
+      </w:r>
+      <w:proofErr w:type="spellEnd"/>
+      <w:r>
+        <w:t xml:space="preserve"> </w:t>
+      </w:r>
+      <w:proofErr w:type="spellStart"/>
+      <w:r>
+        <w:t>branch</w:t>
+      </w:r>
+      <w:proofErr w:type="spellEnd"/>
+      <w:r>
+        <w:t xml:space="preserve"> -m nome-novo</w:t>
+      </w:r>
+    </w:p>
+    <w:p>
+      <w:pPr>
+        <w:pStyle w:val="PargrafodaLista"/>
+        <w:numPr>
+          <w:ilvl w:val="0"/>
+          <w:numId w:val="14"/>
+        </w:numPr>
+        <w:rPr>
+          <w:b/>
+          <w:bCs/>
+        </w:rPr>
+      </w:pPr>
+      <w:r>
+        <w:rPr>
+          <w:b/>
+          <w:bCs/>
+        </w:rPr>
+        <w:t xml:space="preserve">Atualize o </w:t>
+      </w:r>
+      <w:proofErr w:type="spellStart"/>
+      <w:r>
+        <w:rPr>
+          <w:b/>
+          <w:bCs/>
+        </w:rPr>
+        <w:t>branch</w:t>
+      </w:r>
+      <w:proofErr w:type="spellEnd"/>
+      <w:r>
+        <w:rPr>
+          <w:b/>
+          <w:bCs/>
+        </w:rPr>
+        <w:t xml:space="preserve"> remoto:</w:t>
+      </w:r>
+    </w:p>
+    <w:p>
+      <w:pPr>
+        <w:numPr>
+          <w:ilvl w:val="0"/>
+          <w:numId w:val="15"/>
+        </w:numPr>
+      </w:pPr>
+      <w:r>
+        <w:t xml:space="preserve">Primeiro, exclua o </w:t>
+      </w:r>
+      <w:proofErr w:type="spellStart"/>
+      <w:r>
+        <w:t>branch</w:t>
+      </w:r>
+      <w:proofErr w:type="spellEnd"/>
+      <w:r>
+        <w:t xml:space="preserve"> antigo no remoto:</w:t>
+      </w:r>
+    </w:p>
+    <w:p>
+      <w:pPr>
+        <w:ind w:firstLine="935"/>
+      </w:pPr>
+      <w:proofErr w:type="spellStart"/>
+      <w:r>
+        <w:t>git</w:t>
+      </w:r>
+      <w:proofErr w:type="spellEnd"/>
+      <w:r>
+        <w:t xml:space="preserve"> </w:t>
+      </w:r>
+      <w:proofErr w:type="spellStart"/>
+      <w:r>
+        <w:t>push</w:t>
+      </w:r>
+      <w:proofErr w:type="spellEnd"/>
+      <w:r>
+        <w:t xml:space="preserve"> </w:t>
+      </w:r>
+      <w:proofErr w:type="spellStart"/>
+      <w:r>
+        <w:t>origin</w:t>
+      </w:r>
+      <w:proofErr w:type="spellEnd"/>
+      <w:r>
+        <w:t xml:space="preserve"> --delete nome-antigo</w:t>
+      </w:r>
+    </w:p>
+    <w:p>
+      <w:pPr>
+        <w:numPr>
+          <w:ilvl w:val="0"/>
+          <w:numId w:val="15"/>
+        </w:numPr>
+      </w:pPr>
+      <w:r>
+        <w:t xml:space="preserve">Depois, envie o </w:t>
+      </w:r>
+      <w:proofErr w:type="spellStart"/>
+      <w:r>
+        <w:t>branch</w:t>
+      </w:r>
+      <w:proofErr w:type="spellEnd"/>
+      <w:r>
+        <w:t xml:space="preserve"> renomeado:</w:t>
+      </w:r>
+    </w:p>
+    <w:p>
+      <w:pPr>
+        <w:ind w:firstLine="935"/>
+      </w:pPr>
+      <w:proofErr w:type="spellStart"/>
+      <w:r>
+        <w:t>git</w:t>
+      </w:r>
+      <w:proofErr w:type="spellEnd"/>
+      <w:r>
+        <w:t xml:space="preserve"> </w:t>
+      </w:r>
+      <w:proofErr w:type="spellStart"/>
+      <w:r>
+        <w:t>push</w:t>
+      </w:r>
+      <w:proofErr w:type="spellEnd"/>
+      <w:r>
+        <w:t xml:space="preserve"> </w:t>
+      </w:r>
+      <w:proofErr w:type="spellStart"/>
+      <w:r>
+        <w:t>origin</w:t>
+      </w:r>
+      <w:proofErr w:type="spellEnd"/>
+      <w:r>
+        <w:t xml:space="preserve"> nome-novo</w:t>
+      </w:r>
+    </w:p>
+    <w:p>
+      <w:pPr>
+        <w:numPr>
+          <w:ilvl w:val="0"/>
+          <w:numId w:val="15"/>
+        </w:numPr>
+      </w:pPr>
+      <w:r>
+        <w:t xml:space="preserve">E defina o novo </w:t>
+      </w:r>
+      <w:proofErr w:type="spellStart"/>
+      <w:r>
+        <w:t>branch</w:t>
+      </w:r>
+      <w:proofErr w:type="spellEnd"/>
+      <w:r>
+        <w:t xml:space="preserve"> como </w:t>
+      </w:r>
+      <w:proofErr w:type="spellStart"/>
+      <w:r>
+        <w:t>upstream</w:t>
+      </w:r>
+      <w:proofErr w:type="spellEnd"/>
+      <w:r>
+        <w:t>:</w:t>
+      </w:r>
+    </w:p>
+    <w:p>
+      <w:pPr>
+        <w:ind w:firstLine="935"/>
+      </w:pPr>
+      <w:proofErr w:type="spellStart"/>
+      <w:r>
+        <w:t>git</w:t>
+      </w:r>
+      <w:proofErr w:type="spellEnd"/>
+      <w:r>
+        <w:t xml:space="preserve"> </w:t>
+      </w:r>
+      <w:proofErr w:type="spellStart"/>
+      <w:r>
+        <w:t>push</w:t>
+      </w:r>
+      <w:proofErr w:type="spellEnd"/>
+      <w:r>
+        <w:t xml:space="preserve"> --set-</w:t>
+      </w:r>
+      <w:proofErr w:type="spellStart"/>
+      <w:r>
+        <w:t>upstream</w:t>
+      </w:r>
+      <w:proofErr w:type="spellEnd"/>
+      <w:r>
+        <w:t xml:space="preserve"> </w:t>
+      </w:r>
+      <w:proofErr w:type="spellStart"/>
+      <w:r>
+        <w:t>origin</w:t>
+      </w:r>
+      <w:proofErr w:type="spellEnd"/>
+      <w:r>
+        <w:t xml:space="preserve"> nome-novo</w:t>
+      </w:r>
+    </w:p>
+    <w:p>
+      <w:pPr>
+        <w:pStyle w:val="PargrafodaLista"/>
+        <w:numPr>
+          <w:ilvl w:val="0"/>
+          <w:numId w:val="14"/>
+        </w:numPr>
+        <w:rPr>
+          <w:b/>
+          <w:bCs/>
+        </w:rPr>
+      </w:pPr>
+      <w:r>
+        <w:rPr>
+          <w:b/>
+          <w:bCs/>
+        </w:rPr>
+        <w:t xml:space="preserve">Se for o </w:t>
+      </w:r>
+      <w:proofErr w:type="spellStart"/>
+      <w:r>
+        <w:rPr>
+          <w:b/>
+          <w:bCs/>
+        </w:rPr>
+        <w:t>branch</w:t>
+      </w:r>
+      <w:proofErr w:type="spellEnd"/>
+      <w:r>
+        <w:rPr>
+          <w:b/>
+          <w:bCs/>
+        </w:rPr>
+        <w:t xml:space="preserve"> padrão no GitHub, </w:t>
+      </w:r>
+    </w:p>
+    <w:p>
+      <w:pPr>
+        <w:ind w:firstLine="935"/>
+      </w:pPr>
+      <w:r>
+        <w:t>altere também nas configurações do repositório para evitar conflitos.</w:t>
+      </w:r>
+    </w:p>
+    <w:p/>
+    <w:p/>
+    <w:p/>
+    <w:p/>
+    <w:p/>
+    <w:p/>
+    <w:p>
+      <w:pPr>
+        <w:rPr>
+          <w:b/>
+          <w:bCs/>
+        </w:rPr>
+      </w:pPr>
     </w:p>
     <w:p/>
     <w:p/>
@@ -1190,6 +2639,602 @@
     </w:lvl>
   </w:abstractNum>
   <w:abstractNum w:abstractNumId="4" w15:restartNumberingAfterBreak="0">
+    <w:nsid w:val="277B5639"/>
+    <w:multiLevelType w:val="multilevel"/>
+    <w:tmpl w:val="3BA21F30"/>
+    <w:lvl w:ilvl="0">
+      <w:start w:val="1"/>
+      <w:numFmt w:val="bullet"/>
+      <w:lvlText w:val=""/>
+      <w:lvlJc w:val="left"/>
+      <w:pPr>
+        <w:tabs>
+          <w:tab w:val="num" w:pos="720"/>
+        </w:tabs>
+        <w:ind w:left="720" w:hanging="360"/>
+      </w:pPr>
+      <w:rPr>
+        <w:rFonts w:ascii="Symbol" w:hAnsi="Symbol" w:hint="default"/>
+        <w:sz w:val="20"/>
+      </w:rPr>
+    </w:lvl>
+    <w:lvl w:ilvl="1" w:tentative="1">
+      <w:start w:val="1"/>
+      <w:numFmt w:val="bullet"/>
+      <w:lvlText w:val="o"/>
+      <w:lvlJc w:val="left"/>
+      <w:pPr>
+        <w:tabs>
+          <w:tab w:val="num" w:pos="1440"/>
+        </w:tabs>
+        <w:ind w:left="1440" w:hanging="360"/>
+      </w:pPr>
+      <w:rPr>
+        <w:rFonts w:ascii="Courier New" w:hAnsi="Courier New" w:hint="default"/>
+        <w:sz w:val="20"/>
+      </w:rPr>
+    </w:lvl>
+    <w:lvl w:ilvl="2" w:tentative="1">
+      <w:start w:val="1"/>
+      <w:numFmt w:val="bullet"/>
+      <w:lvlText w:val=""/>
+      <w:lvlJc w:val="left"/>
+      <w:pPr>
+        <w:tabs>
+          <w:tab w:val="num" w:pos="2160"/>
+        </w:tabs>
+        <w:ind w:left="2160" w:hanging="360"/>
+      </w:pPr>
+      <w:rPr>
+        <w:rFonts w:ascii="Wingdings" w:hAnsi="Wingdings" w:hint="default"/>
+        <w:sz w:val="20"/>
+      </w:rPr>
+    </w:lvl>
+    <w:lvl w:ilvl="3" w:tentative="1">
+      <w:start w:val="1"/>
+      <w:numFmt w:val="bullet"/>
+      <w:lvlText w:val=""/>
+      <w:lvlJc w:val="left"/>
+      <w:pPr>
+        <w:tabs>
+          <w:tab w:val="num" w:pos="2880"/>
+        </w:tabs>
+        <w:ind w:left="2880" w:hanging="360"/>
+      </w:pPr>
+      <w:rPr>
+        <w:rFonts w:ascii="Wingdings" w:hAnsi="Wingdings" w:hint="default"/>
+        <w:sz w:val="20"/>
+      </w:rPr>
+    </w:lvl>
+    <w:lvl w:ilvl="4" w:tentative="1">
+      <w:start w:val="1"/>
+      <w:numFmt w:val="bullet"/>
+      <w:lvlText w:val=""/>
+      <w:lvlJc w:val="left"/>
+      <w:pPr>
+        <w:tabs>
+          <w:tab w:val="num" w:pos="3600"/>
+        </w:tabs>
+        <w:ind w:left="3600" w:hanging="360"/>
+      </w:pPr>
+      <w:rPr>
+        <w:rFonts w:ascii="Wingdings" w:hAnsi="Wingdings" w:hint="default"/>
+        <w:sz w:val="20"/>
+      </w:rPr>
+    </w:lvl>
+    <w:lvl w:ilvl="5" w:tentative="1">
+      <w:start w:val="1"/>
+      <w:numFmt w:val="bullet"/>
+      <w:lvlText w:val=""/>
+      <w:lvlJc w:val="left"/>
+      <w:pPr>
+        <w:tabs>
+          <w:tab w:val="num" w:pos="4320"/>
+        </w:tabs>
+        <w:ind w:left="4320" w:hanging="360"/>
+      </w:pPr>
+      <w:rPr>
+        <w:rFonts w:ascii="Wingdings" w:hAnsi="Wingdings" w:hint="default"/>
+        <w:sz w:val="20"/>
+      </w:rPr>
+    </w:lvl>
+    <w:lvl w:ilvl="6" w:tentative="1">
+      <w:start w:val="1"/>
+      <w:numFmt w:val="bullet"/>
+      <w:lvlText w:val=""/>
+      <w:lvlJc w:val="left"/>
+      <w:pPr>
+        <w:tabs>
+          <w:tab w:val="num" w:pos="5040"/>
+        </w:tabs>
+        <w:ind w:left="5040" w:hanging="360"/>
+      </w:pPr>
+      <w:rPr>
+        <w:rFonts w:ascii="Wingdings" w:hAnsi="Wingdings" w:hint="default"/>
+        <w:sz w:val="20"/>
+      </w:rPr>
+    </w:lvl>
+    <w:lvl w:ilvl="7" w:tentative="1">
+      <w:start w:val="1"/>
+      <w:numFmt w:val="bullet"/>
+      <w:lvlText w:val=""/>
+      <w:lvlJc w:val="left"/>
+      <w:pPr>
+        <w:tabs>
+          <w:tab w:val="num" w:pos="5760"/>
+        </w:tabs>
+        <w:ind w:left="5760" w:hanging="360"/>
+      </w:pPr>
+      <w:rPr>
+        <w:rFonts w:ascii="Wingdings" w:hAnsi="Wingdings" w:hint="default"/>
+        <w:sz w:val="20"/>
+      </w:rPr>
+    </w:lvl>
+    <w:lvl w:ilvl="8" w:tentative="1">
+      <w:start w:val="1"/>
+      <w:numFmt w:val="bullet"/>
+      <w:lvlText w:val=""/>
+      <w:lvlJc w:val="left"/>
+      <w:pPr>
+        <w:tabs>
+          <w:tab w:val="num" w:pos="6480"/>
+        </w:tabs>
+        <w:ind w:left="6480" w:hanging="360"/>
+      </w:pPr>
+      <w:rPr>
+        <w:rFonts w:ascii="Wingdings" w:hAnsi="Wingdings" w:hint="default"/>
+        <w:sz w:val="20"/>
+      </w:rPr>
+    </w:lvl>
+  </w:abstractNum>
+  <w:abstractNum w:abstractNumId="5" w15:restartNumberingAfterBreak="0">
+    <w:nsid w:val="334E698B"/>
+    <w:multiLevelType w:val="multilevel"/>
+    <w:tmpl w:val="76AC1760"/>
+    <w:lvl w:ilvl="0">
+      <w:start w:val="1"/>
+      <w:numFmt w:val="bullet"/>
+      <w:lvlText w:val=""/>
+      <w:lvlJc w:val="left"/>
+      <w:pPr>
+        <w:tabs>
+          <w:tab w:val="num" w:pos="720"/>
+        </w:tabs>
+        <w:ind w:left="720" w:hanging="360"/>
+      </w:pPr>
+      <w:rPr>
+        <w:rFonts w:ascii="Symbol" w:hAnsi="Symbol" w:hint="default"/>
+        <w:sz w:val="20"/>
+      </w:rPr>
+    </w:lvl>
+    <w:lvl w:ilvl="1" w:tentative="1">
+      <w:start w:val="1"/>
+      <w:numFmt w:val="bullet"/>
+      <w:lvlText w:val="o"/>
+      <w:lvlJc w:val="left"/>
+      <w:pPr>
+        <w:tabs>
+          <w:tab w:val="num" w:pos="1440"/>
+        </w:tabs>
+        <w:ind w:left="1440" w:hanging="360"/>
+      </w:pPr>
+      <w:rPr>
+        <w:rFonts w:ascii="Courier New" w:hAnsi="Courier New" w:hint="default"/>
+        <w:sz w:val="20"/>
+      </w:rPr>
+    </w:lvl>
+    <w:lvl w:ilvl="2" w:tentative="1">
+      <w:start w:val="1"/>
+      <w:numFmt w:val="bullet"/>
+      <w:lvlText w:val=""/>
+      <w:lvlJc w:val="left"/>
+      <w:pPr>
+        <w:tabs>
+          <w:tab w:val="num" w:pos="2160"/>
+        </w:tabs>
+        <w:ind w:left="2160" w:hanging="360"/>
+      </w:pPr>
+      <w:rPr>
+        <w:rFonts w:ascii="Wingdings" w:hAnsi="Wingdings" w:hint="default"/>
+        <w:sz w:val="20"/>
+      </w:rPr>
+    </w:lvl>
+    <w:lvl w:ilvl="3" w:tentative="1">
+      <w:start w:val="1"/>
+      <w:numFmt w:val="bullet"/>
+      <w:lvlText w:val=""/>
+      <w:lvlJc w:val="left"/>
+      <w:pPr>
+        <w:tabs>
+          <w:tab w:val="num" w:pos="2880"/>
+        </w:tabs>
+        <w:ind w:left="2880" w:hanging="360"/>
+      </w:pPr>
+      <w:rPr>
+        <w:rFonts w:ascii="Wingdings" w:hAnsi="Wingdings" w:hint="default"/>
+        <w:sz w:val="20"/>
+      </w:rPr>
+    </w:lvl>
+    <w:lvl w:ilvl="4" w:tentative="1">
+      <w:start w:val="1"/>
+      <w:numFmt w:val="bullet"/>
+      <w:lvlText w:val=""/>
+      <w:lvlJc w:val="left"/>
+      <w:pPr>
+        <w:tabs>
+          <w:tab w:val="num" w:pos="3600"/>
+        </w:tabs>
+        <w:ind w:left="3600" w:hanging="360"/>
+      </w:pPr>
+      <w:rPr>
+        <w:rFonts w:ascii="Wingdings" w:hAnsi="Wingdings" w:hint="default"/>
+        <w:sz w:val="20"/>
+      </w:rPr>
+    </w:lvl>
+    <w:lvl w:ilvl="5" w:tentative="1">
+      <w:start w:val="1"/>
+      <w:numFmt w:val="bullet"/>
+      <w:lvlText w:val=""/>
+      <w:lvlJc w:val="left"/>
+      <w:pPr>
+        <w:tabs>
+          <w:tab w:val="num" w:pos="4320"/>
+        </w:tabs>
+        <w:ind w:left="4320" w:hanging="360"/>
+      </w:pPr>
+      <w:rPr>
+        <w:rFonts w:ascii="Wingdings" w:hAnsi="Wingdings" w:hint="default"/>
+        <w:sz w:val="20"/>
+      </w:rPr>
+    </w:lvl>
+    <w:lvl w:ilvl="6" w:tentative="1">
+      <w:start w:val="1"/>
+      <w:numFmt w:val="bullet"/>
+      <w:lvlText w:val=""/>
+      <w:lvlJc w:val="left"/>
+      <w:pPr>
+        <w:tabs>
+          <w:tab w:val="num" w:pos="5040"/>
+        </w:tabs>
+        <w:ind w:left="5040" w:hanging="360"/>
+      </w:pPr>
+      <w:rPr>
+        <w:rFonts w:ascii="Wingdings" w:hAnsi="Wingdings" w:hint="default"/>
+        <w:sz w:val="20"/>
+      </w:rPr>
+    </w:lvl>
+    <w:lvl w:ilvl="7" w:tentative="1">
+      <w:start w:val="1"/>
+      <w:numFmt w:val="bullet"/>
+      <w:lvlText w:val=""/>
+      <w:lvlJc w:val="left"/>
+      <w:pPr>
+        <w:tabs>
+          <w:tab w:val="num" w:pos="5760"/>
+        </w:tabs>
+        <w:ind w:left="5760" w:hanging="360"/>
+      </w:pPr>
+      <w:rPr>
+        <w:rFonts w:ascii="Wingdings" w:hAnsi="Wingdings" w:hint="default"/>
+        <w:sz w:val="20"/>
+      </w:rPr>
+    </w:lvl>
+    <w:lvl w:ilvl="8" w:tentative="1">
+      <w:start w:val="1"/>
+      <w:numFmt w:val="bullet"/>
+      <w:lvlText w:val=""/>
+      <w:lvlJc w:val="left"/>
+      <w:pPr>
+        <w:tabs>
+          <w:tab w:val="num" w:pos="6480"/>
+        </w:tabs>
+        <w:ind w:left="6480" w:hanging="360"/>
+      </w:pPr>
+      <w:rPr>
+        <w:rFonts w:ascii="Wingdings" w:hAnsi="Wingdings" w:hint="default"/>
+        <w:sz w:val="20"/>
+      </w:rPr>
+    </w:lvl>
+  </w:abstractNum>
+  <w:abstractNum w:abstractNumId="6" w15:restartNumberingAfterBreak="0">
+    <w:nsid w:val="34AC5C05"/>
+    <w:multiLevelType w:val="multilevel"/>
+    <w:tmpl w:val="0CD6E12E"/>
+    <w:lvl w:ilvl="0">
+      <w:start w:val="1"/>
+      <w:numFmt w:val="bullet"/>
+      <w:lvlText w:val=""/>
+      <w:lvlJc w:val="left"/>
+      <w:pPr>
+        <w:tabs>
+          <w:tab w:val="num" w:pos="720"/>
+        </w:tabs>
+        <w:ind w:left="720" w:hanging="360"/>
+      </w:pPr>
+      <w:rPr>
+        <w:rFonts w:ascii="Symbol" w:hAnsi="Symbol" w:hint="default"/>
+        <w:sz w:val="20"/>
+      </w:rPr>
+    </w:lvl>
+    <w:lvl w:ilvl="1" w:tentative="1">
+      <w:start w:val="1"/>
+      <w:numFmt w:val="bullet"/>
+      <w:lvlText w:val="o"/>
+      <w:lvlJc w:val="left"/>
+      <w:pPr>
+        <w:tabs>
+          <w:tab w:val="num" w:pos="1440"/>
+        </w:tabs>
+        <w:ind w:left="1440" w:hanging="360"/>
+      </w:pPr>
+      <w:rPr>
+        <w:rFonts w:ascii="Courier New" w:hAnsi="Courier New" w:hint="default"/>
+        <w:sz w:val="20"/>
+      </w:rPr>
+    </w:lvl>
+    <w:lvl w:ilvl="2" w:tentative="1">
+      <w:start w:val="1"/>
+      <w:numFmt w:val="bullet"/>
+      <w:lvlText w:val=""/>
+      <w:lvlJc w:val="left"/>
+      <w:pPr>
+        <w:tabs>
+          <w:tab w:val="num" w:pos="2160"/>
+        </w:tabs>
+        <w:ind w:left="2160" w:hanging="360"/>
+      </w:pPr>
+      <w:rPr>
+        <w:rFonts w:ascii="Wingdings" w:hAnsi="Wingdings" w:hint="default"/>
+        <w:sz w:val="20"/>
+      </w:rPr>
+    </w:lvl>
+    <w:lvl w:ilvl="3" w:tentative="1">
+      <w:start w:val="1"/>
+      <w:numFmt w:val="bullet"/>
+      <w:lvlText w:val=""/>
+      <w:lvlJc w:val="left"/>
+      <w:pPr>
+        <w:tabs>
+          <w:tab w:val="num" w:pos="2880"/>
+        </w:tabs>
+        <w:ind w:left="2880" w:hanging="360"/>
+      </w:pPr>
+      <w:rPr>
+        <w:rFonts w:ascii="Wingdings" w:hAnsi="Wingdings" w:hint="default"/>
+        <w:sz w:val="20"/>
+      </w:rPr>
+    </w:lvl>
+    <w:lvl w:ilvl="4" w:tentative="1">
+      <w:start w:val="1"/>
+      <w:numFmt w:val="bullet"/>
+      <w:lvlText w:val=""/>
+      <w:lvlJc w:val="left"/>
+      <w:pPr>
+        <w:tabs>
+          <w:tab w:val="num" w:pos="3600"/>
+        </w:tabs>
+        <w:ind w:left="3600" w:hanging="360"/>
+      </w:pPr>
+      <w:rPr>
+        <w:rFonts w:ascii="Wingdings" w:hAnsi="Wingdings" w:hint="default"/>
+        <w:sz w:val="20"/>
+      </w:rPr>
+    </w:lvl>
+    <w:lvl w:ilvl="5" w:tentative="1">
+      <w:start w:val="1"/>
+      <w:numFmt w:val="bullet"/>
+      <w:lvlText w:val=""/>
+      <w:lvlJc w:val="left"/>
+      <w:pPr>
+        <w:tabs>
+          <w:tab w:val="num" w:pos="4320"/>
+        </w:tabs>
+        <w:ind w:left="4320" w:hanging="360"/>
+      </w:pPr>
+      <w:rPr>
+        <w:rFonts w:ascii="Wingdings" w:hAnsi="Wingdings" w:hint="default"/>
+        <w:sz w:val="20"/>
+      </w:rPr>
+    </w:lvl>
+    <w:lvl w:ilvl="6" w:tentative="1">
+      <w:start w:val="1"/>
+      <w:numFmt w:val="bullet"/>
+      <w:lvlText w:val=""/>
+      <w:lvlJc w:val="left"/>
+      <w:pPr>
+        <w:tabs>
+          <w:tab w:val="num" w:pos="5040"/>
+        </w:tabs>
+        <w:ind w:left="5040" w:hanging="360"/>
+      </w:pPr>
+      <w:rPr>
+        <w:rFonts w:ascii="Wingdings" w:hAnsi="Wingdings" w:hint="default"/>
+        <w:sz w:val="20"/>
+      </w:rPr>
+    </w:lvl>
+    <w:lvl w:ilvl="7" w:tentative="1">
+      <w:start w:val="1"/>
+      <w:numFmt w:val="bullet"/>
+      <w:lvlText w:val=""/>
+      <w:lvlJc w:val="left"/>
+      <w:pPr>
+        <w:tabs>
+          <w:tab w:val="num" w:pos="5760"/>
+        </w:tabs>
+        <w:ind w:left="5760" w:hanging="360"/>
+      </w:pPr>
+      <w:rPr>
+        <w:rFonts w:ascii="Wingdings" w:hAnsi="Wingdings" w:hint="default"/>
+        <w:sz w:val="20"/>
+      </w:rPr>
+    </w:lvl>
+    <w:lvl w:ilvl="8" w:tentative="1">
+      <w:start w:val="1"/>
+      <w:numFmt w:val="bullet"/>
+      <w:lvlText w:val=""/>
+      <w:lvlJc w:val="left"/>
+      <w:pPr>
+        <w:tabs>
+          <w:tab w:val="num" w:pos="6480"/>
+        </w:tabs>
+        <w:ind w:left="6480" w:hanging="360"/>
+      </w:pPr>
+      <w:rPr>
+        <w:rFonts w:ascii="Wingdings" w:hAnsi="Wingdings" w:hint="default"/>
+        <w:sz w:val="20"/>
+      </w:rPr>
+    </w:lvl>
+  </w:abstractNum>
+  <w:abstractNum w:abstractNumId="7" w15:restartNumberingAfterBreak="0">
+    <w:nsid w:val="43EC7C4B"/>
+    <w:multiLevelType w:val="multilevel"/>
+    <w:tmpl w:val="40624680"/>
+    <w:lvl w:ilvl="0">
+      <w:start w:val="1"/>
+      <w:numFmt w:val="bullet"/>
+      <w:lvlText w:val=""/>
+      <w:lvlJc w:val="left"/>
+      <w:pPr>
+        <w:tabs>
+          <w:tab w:val="num" w:pos="720"/>
+        </w:tabs>
+        <w:ind w:left="720" w:hanging="360"/>
+      </w:pPr>
+      <w:rPr>
+        <w:rFonts w:ascii="Symbol" w:hAnsi="Symbol" w:hint="default"/>
+        <w:sz w:val="20"/>
+      </w:rPr>
+    </w:lvl>
+    <w:lvl w:ilvl="1" w:tentative="1">
+      <w:start w:val="1"/>
+      <w:numFmt w:val="bullet"/>
+      <w:lvlText w:val="o"/>
+      <w:lvlJc w:val="left"/>
+      <w:pPr>
+        <w:tabs>
+          <w:tab w:val="num" w:pos="1440"/>
+        </w:tabs>
+        <w:ind w:left="1440" w:hanging="360"/>
+      </w:pPr>
+      <w:rPr>
+        <w:rFonts w:ascii="Courier New" w:hAnsi="Courier New" w:hint="default"/>
+        <w:sz w:val="20"/>
+      </w:rPr>
+    </w:lvl>
+    <w:lvl w:ilvl="2" w:tentative="1">
+      <w:start w:val="1"/>
+      <w:numFmt w:val="bullet"/>
+      <w:lvlText w:val=""/>
+      <w:lvlJc w:val="left"/>
+      <w:pPr>
+        <w:tabs>
+          <w:tab w:val="num" w:pos="2160"/>
+        </w:tabs>
+        <w:ind w:left="2160" w:hanging="360"/>
+      </w:pPr>
+      <w:rPr>
+        <w:rFonts w:ascii="Wingdings" w:hAnsi="Wingdings" w:hint="default"/>
+        <w:sz w:val="20"/>
+      </w:rPr>
+    </w:lvl>
+    <w:lvl w:ilvl="3" w:tentative="1">
+      <w:start w:val="1"/>
+      <w:numFmt w:val="bullet"/>
+      <w:lvlText w:val=""/>
+      <w:lvlJc w:val="left"/>
+      <w:pPr>
+        <w:tabs>
+          <w:tab w:val="num" w:pos="2880"/>
+        </w:tabs>
+        <w:ind w:left="2880" w:hanging="360"/>
+      </w:pPr>
+      <w:rPr>
+        <w:rFonts w:ascii="Wingdings" w:hAnsi="Wingdings" w:hint="default"/>
+        <w:sz w:val="20"/>
+      </w:rPr>
+    </w:lvl>
+    <w:lvl w:ilvl="4" w:tentative="1">
+      <w:start w:val="1"/>
+      <w:numFmt w:val="bullet"/>
+      <w:lvlText w:val=""/>
+      <w:lvlJc w:val="left"/>
+      <w:pPr>
+        <w:tabs>
+          <w:tab w:val="num" w:pos="3600"/>
+        </w:tabs>
+        <w:ind w:left="3600" w:hanging="360"/>
+      </w:pPr>
+      <w:rPr>
+        <w:rFonts w:ascii="Wingdings" w:hAnsi="Wingdings" w:hint="default"/>
+        <w:sz w:val="20"/>
+      </w:rPr>
+    </w:lvl>
+    <w:lvl w:ilvl="5" w:tentative="1">
+      <w:start w:val="1"/>
+      <w:numFmt w:val="bullet"/>
+      <w:lvlText w:val=""/>
+      <w:lvlJc w:val="left"/>
+      <w:pPr>
+        <w:tabs>
+          <w:tab w:val="num" w:pos="4320"/>
+        </w:tabs>
+        <w:ind w:left="4320" w:hanging="360"/>
+      </w:pPr>
+      <w:rPr>
+        <w:rFonts w:ascii="Wingdings" w:hAnsi="Wingdings" w:hint="default"/>
+        <w:sz w:val="20"/>
+      </w:rPr>
+    </w:lvl>
+    <w:lvl w:ilvl="6" w:tentative="1">
+      <w:start w:val="1"/>
+      <w:numFmt w:val="bullet"/>
+      <w:lvlText w:val=""/>
+      <w:lvlJc w:val="left"/>
+      <w:pPr>
+        <w:tabs>
+          <w:tab w:val="num" w:pos="5040"/>
+        </w:tabs>
+        <w:ind w:left="5040" w:hanging="360"/>
+      </w:pPr>
+      <w:rPr>
+        <w:rFonts w:ascii="Wingdings" w:hAnsi="Wingdings" w:hint="default"/>
+        <w:sz w:val="20"/>
+      </w:rPr>
+    </w:lvl>
+    <w:lvl w:ilvl="7" w:tentative="1">
+      <w:start w:val="1"/>
+      <w:numFmt w:val="bullet"/>
+      <w:lvlText w:val=""/>
+      <w:lvlJc w:val="left"/>
+      <w:pPr>
+        <w:tabs>
+          <w:tab w:val="num" w:pos="5760"/>
+        </w:tabs>
+        <w:ind w:left="5760" w:hanging="360"/>
+      </w:pPr>
+      <w:rPr>
+        <w:rFonts w:ascii="Wingdings" w:hAnsi="Wingdings" w:hint="default"/>
+        <w:sz w:val="20"/>
+      </w:rPr>
+    </w:lvl>
+    <w:lvl w:ilvl="8" w:tentative="1">
+      <w:start w:val="1"/>
+      <w:numFmt w:val="bullet"/>
+      <w:lvlText w:val=""/>
+      <w:lvlJc w:val="left"/>
+      <w:pPr>
+        <w:tabs>
+          <w:tab w:val="num" w:pos="6480"/>
+        </w:tabs>
+        <w:ind w:left="6480" w:hanging="360"/>
+      </w:pPr>
+      <w:rPr>
+        <w:rFonts w:ascii="Wingdings" w:hAnsi="Wingdings" w:hint="default"/>
+        <w:sz w:val="20"/>
+      </w:rPr>
+    </w:lvl>
+  </w:abstractNum>
+  <w:abstractNum w:abstractNumId="8" w15:restartNumberingAfterBreak="0">
     <w:nsid w:val="4472125B"/>
     <w:multiLevelType w:val="multilevel"/>
     <w:tmpl w:val="B12C7518"/>
@@ -1338,7 +3383,394 @@
       </w:rPr>
     </w:lvl>
   </w:abstractNum>
-  <w:abstractNum w:abstractNumId="5" w15:restartNumberingAfterBreak="0">
+  <w:abstractNum w:abstractNumId="9" w15:restartNumberingAfterBreak="0">
+    <w:nsid w:val="531B7CFF"/>
+    <w:multiLevelType w:val="multilevel"/>
+    <w:tmpl w:val="36C6D670"/>
+    <w:lvl w:ilvl="0">
+      <w:start w:val="1"/>
+      <w:numFmt w:val="bullet"/>
+      <w:lvlText w:val=""/>
+      <w:lvlJc w:val="left"/>
+      <w:pPr>
+        <w:tabs>
+          <w:tab w:val="num" w:pos="720"/>
+        </w:tabs>
+        <w:ind w:left="720" w:hanging="360"/>
+      </w:pPr>
+      <w:rPr>
+        <w:rFonts w:ascii="Symbol" w:hAnsi="Symbol" w:hint="default"/>
+        <w:sz w:val="20"/>
+      </w:rPr>
+    </w:lvl>
+    <w:lvl w:ilvl="1" w:tentative="1">
+      <w:start w:val="1"/>
+      <w:numFmt w:val="bullet"/>
+      <w:lvlText w:val="o"/>
+      <w:lvlJc w:val="left"/>
+      <w:pPr>
+        <w:tabs>
+          <w:tab w:val="num" w:pos="1440"/>
+        </w:tabs>
+        <w:ind w:left="1440" w:hanging="360"/>
+      </w:pPr>
+      <w:rPr>
+        <w:rFonts w:ascii="Courier New" w:hAnsi="Courier New" w:hint="default"/>
+        <w:sz w:val="20"/>
+      </w:rPr>
+    </w:lvl>
+    <w:lvl w:ilvl="2" w:tentative="1">
+      <w:start w:val="1"/>
+      <w:numFmt w:val="bullet"/>
+      <w:lvlText w:val=""/>
+      <w:lvlJc w:val="left"/>
+      <w:pPr>
+        <w:tabs>
+          <w:tab w:val="num" w:pos="2160"/>
+        </w:tabs>
+        <w:ind w:left="2160" w:hanging="360"/>
+      </w:pPr>
+      <w:rPr>
+        <w:rFonts w:ascii="Wingdings" w:hAnsi="Wingdings" w:hint="default"/>
+        <w:sz w:val="20"/>
+      </w:rPr>
+    </w:lvl>
+    <w:lvl w:ilvl="3" w:tentative="1">
+      <w:start w:val="1"/>
+      <w:numFmt w:val="bullet"/>
+      <w:lvlText w:val=""/>
+      <w:lvlJc w:val="left"/>
+      <w:pPr>
+        <w:tabs>
+          <w:tab w:val="num" w:pos="2880"/>
+        </w:tabs>
+        <w:ind w:left="2880" w:hanging="360"/>
+      </w:pPr>
+      <w:rPr>
+        <w:rFonts w:ascii="Wingdings" w:hAnsi="Wingdings" w:hint="default"/>
+        <w:sz w:val="20"/>
+      </w:rPr>
+    </w:lvl>
+    <w:lvl w:ilvl="4" w:tentative="1">
+      <w:start w:val="1"/>
+      <w:numFmt w:val="bullet"/>
+      <w:lvlText w:val=""/>
+      <w:lvlJc w:val="left"/>
+      <w:pPr>
+        <w:tabs>
+          <w:tab w:val="num" w:pos="3600"/>
+        </w:tabs>
+        <w:ind w:left="3600" w:hanging="360"/>
+      </w:pPr>
+      <w:rPr>
+        <w:rFonts w:ascii="Wingdings" w:hAnsi="Wingdings" w:hint="default"/>
+        <w:sz w:val="20"/>
+      </w:rPr>
+    </w:lvl>
+    <w:lvl w:ilvl="5" w:tentative="1">
+      <w:start w:val="1"/>
+      <w:numFmt w:val="bullet"/>
+      <w:lvlText w:val=""/>
+      <w:lvlJc w:val="left"/>
+      <w:pPr>
+        <w:tabs>
+          <w:tab w:val="num" w:pos="4320"/>
+        </w:tabs>
+        <w:ind w:left="4320" w:hanging="360"/>
+      </w:pPr>
+      <w:rPr>
+        <w:rFonts w:ascii="Wingdings" w:hAnsi="Wingdings" w:hint="default"/>
+        <w:sz w:val="20"/>
+      </w:rPr>
+    </w:lvl>
+    <w:lvl w:ilvl="6" w:tentative="1">
+      <w:start w:val="1"/>
+      <w:numFmt w:val="bullet"/>
+      <w:lvlText w:val=""/>
+      <w:lvlJc w:val="left"/>
+      <w:pPr>
+        <w:tabs>
+          <w:tab w:val="num" w:pos="5040"/>
+        </w:tabs>
+        <w:ind w:left="5040" w:hanging="360"/>
+      </w:pPr>
+      <w:rPr>
+        <w:rFonts w:ascii="Wingdings" w:hAnsi="Wingdings" w:hint="default"/>
+        <w:sz w:val="20"/>
+      </w:rPr>
+    </w:lvl>
+    <w:lvl w:ilvl="7" w:tentative="1">
+      <w:start w:val="1"/>
+      <w:numFmt w:val="bullet"/>
+      <w:lvlText w:val=""/>
+      <w:lvlJc w:val="left"/>
+      <w:pPr>
+        <w:tabs>
+          <w:tab w:val="num" w:pos="5760"/>
+        </w:tabs>
+        <w:ind w:left="5760" w:hanging="360"/>
+      </w:pPr>
+      <w:rPr>
+        <w:rFonts w:ascii="Wingdings" w:hAnsi="Wingdings" w:hint="default"/>
+        <w:sz w:val="20"/>
+      </w:rPr>
+    </w:lvl>
+    <w:lvl w:ilvl="8" w:tentative="1">
+      <w:start w:val="1"/>
+      <w:numFmt w:val="bullet"/>
+      <w:lvlText w:val=""/>
+      <w:lvlJc w:val="left"/>
+      <w:pPr>
+        <w:tabs>
+          <w:tab w:val="num" w:pos="6480"/>
+        </w:tabs>
+        <w:ind w:left="6480" w:hanging="360"/>
+      </w:pPr>
+      <w:rPr>
+        <w:rFonts w:ascii="Wingdings" w:hAnsi="Wingdings" w:hint="default"/>
+        <w:sz w:val="20"/>
+      </w:rPr>
+    </w:lvl>
+  </w:abstractNum>
+  <w:abstractNum w:abstractNumId="10" w15:restartNumberingAfterBreak="0">
+    <w:nsid w:val="63E924FA"/>
+    <w:multiLevelType w:val="hybridMultilevel"/>
+    <w:tmpl w:val="BFDC11FE"/>
+    <w:lvl w:ilvl="0" w:tplc="E9528A6C">
+      <w:start w:val="1"/>
+      <w:numFmt w:val="decimal"/>
+      <w:lvlText w:val="%1-"/>
+      <w:lvlJc w:val="left"/>
+      <w:pPr>
+        <w:ind w:left="700" w:hanging="360"/>
+      </w:pPr>
+      <w:rPr>
+        <w:rFonts w:hint="default"/>
+      </w:rPr>
+    </w:lvl>
+    <w:lvl w:ilvl="1" w:tplc="04160019" w:tentative="1">
+      <w:start w:val="1"/>
+      <w:numFmt w:val="lowerLetter"/>
+      <w:lvlText w:val="%2."/>
+      <w:lvlJc w:val="left"/>
+      <w:pPr>
+        <w:ind w:left="1420" w:hanging="360"/>
+      </w:pPr>
+    </w:lvl>
+    <w:lvl w:ilvl="2" w:tplc="0416001B" w:tentative="1">
+      <w:start w:val="1"/>
+      <w:numFmt w:val="lowerRoman"/>
+      <w:lvlText w:val="%3."/>
+      <w:lvlJc w:val="right"/>
+      <w:pPr>
+        <w:ind w:left="2140" w:hanging="180"/>
+      </w:pPr>
+    </w:lvl>
+    <w:lvl w:ilvl="3" w:tplc="0416000F" w:tentative="1">
+      <w:start w:val="1"/>
+      <w:numFmt w:val="decimal"/>
+      <w:lvlText w:val="%4."/>
+      <w:lvlJc w:val="left"/>
+      <w:pPr>
+        <w:ind w:left="2860" w:hanging="360"/>
+      </w:pPr>
+    </w:lvl>
+    <w:lvl w:ilvl="4" w:tplc="04160019" w:tentative="1">
+      <w:start w:val="1"/>
+      <w:numFmt w:val="lowerLetter"/>
+      <w:lvlText w:val="%5."/>
+      <w:lvlJc w:val="left"/>
+      <w:pPr>
+        <w:ind w:left="3580" w:hanging="360"/>
+      </w:pPr>
+    </w:lvl>
+    <w:lvl w:ilvl="5" w:tplc="0416001B" w:tentative="1">
+      <w:start w:val="1"/>
+      <w:numFmt w:val="lowerRoman"/>
+      <w:lvlText w:val="%6."/>
+      <w:lvlJc w:val="right"/>
+      <w:pPr>
+        <w:ind w:left="4300" w:hanging="180"/>
+      </w:pPr>
+    </w:lvl>
+    <w:lvl w:ilvl="6" w:tplc="0416000F" w:tentative="1">
+      <w:start w:val="1"/>
+      <w:numFmt w:val="decimal"/>
+      <w:lvlText w:val="%7."/>
+      <w:lvlJc w:val="left"/>
+      <w:pPr>
+        <w:ind w:left="5020" w:hanging="360"/>
+      </w:pPr>
+    </w:lvl>
+    <w:lvl w:ilvl="7" w:tplc="04160019" w:tentative="1">
+      <w:start w:val="1"/>
+      <w:numFmt w:val="lowerLetter"/>
+      <w:lvlText w:val="%8."/>
+      <w:lvlJc w:val="left"/>
+      <w:pPr>
+        <w:ind w:left="5740" w:hanging="360"/>
+      </w:pPr>
+    </w:lvl>
+    <w:lvl w:ilvl="8" w:tplc="0416001B" w:tentative="1">
+      <w:start w:val="1"/>
+      <w:numFmt w:val="lowerRoman"/>
+      <w:lvlText w:val="%9."/>
+      <w:lvlJc w:val="right"/>
+      <w:pPr>
+        <w:ind w:left="6460" w:hanging="180"/>
+      </w:pPr>
+    </w:lvl>
+  </w:abstractNum>
+  <w:abstractNum w:abstractNumId="11" w15:restartNumberingAfterBreak="0">
+    <w:nsid w:val="75E22BDC"/>
+    <w:multiLevelType w:val="multilevel"/>
+    <w:tmpl w:val="A0CC615A"/>
+    <w:lvl w:ilvl="0">
+      <w:start w:val="1"/>
+      <w:numFmt w:val="bullet"/>
+      <w:lvlText w:val=""/>
+      <w:lvlJc w:val="left"/>
+      <w:pPr>
+        <w:tabs>
+          <w:tab w:val="num" w:pos="720"/>
+        </w:tabs>
+        <w:ind w:left="720" w:hanging="360"/>
+      </w:pPr>
+      <w:rPr>
+        <w:rFonts w:ascii="Symbol" w:hAnsi="Symbol" w:hint="default"/>
+        <w:sz w:val="20"/>
+      </w:rPr>
+    </w:lvl>
+    <w:lvl w:ilvl="1" w:tentative="1">
+      <w:start w:val="1"/>
+      <w:numFmt w:val="bullet"/>
+      <w:lvlText w:val="o"/>
+      <w:lvlJc w:val="left"/>
+      <w:pPr>
+        <w:tabs>
+          <w:tab w:val="num" w:pos="1440"/>
+        </w:tabs>
+        <w:ind w:left="1440" w:hanging="360"/>
+      </w:pPr>
+      <w:rPr>
+        <w:rFonts w:ascii="Courier New" w:hAnsi="Courier New" w:hint="default"/>
+        <w:sz w:val="20"/>
+      </w:rPr>
+    </w:lvl>
+    <w:lvl w:ilvl="2" w:tentative="1">
+      <w:start w:val="1"/>
+      <w:numFmt w:val="bullet"/>
+      <w:lvlText w:val=""/>
+      <w:lvlJc w:val="left"/>
+      <w:pPr>
+        <w:tabs>
+          <w:tab w:val="num" w:pos="2160"/>
+        </w:tabs>
+        <w:ind w:left="2160" w:hanging="360"/>
+      </w:pPr>
+      <w:rPr>
+        <w:rFonts w:ascii="Wingdings" w:hAnsi="Wingdings" w:hint="default"/>
+        <w:sz w:val="20"/>
+      </w:rPr>
+    </w:lvl>
+    <w:lvl w:ilvl="3" w:tentative="1">
+      <w:start w:val="1"/>
+      <w:numFmt w:val="bullet"/>
+      <w:lvlText w:val=""/>
+      <w:lvlJc w:val="left"/>
+      <w:pPr>
+        <w:tabs>
+          <w:tab w:val="num" w:pos="2880"/>
+        </w:tabs>
+        <w:ind w:left="2880" w:hanging="360"/>
+      </w:pPr>
+      <w:rPr>
+        <w:rFonts w:ascii="Wingdings" w:hAnsi="Wingdings" w:hint="default"/>
+        <w:sz w:val="20"/>
+      </w:rPr>
+    </w:lvl>
+    <w:lvl w:ilvl="4" w:tentative="1">
+      <w:start w:val="1"/>
+      <w:numFmt w:val="bullet"/>
+      <w:lvlText w:val=""/>
+      <w:lvlJc w:val="left"/>
+      <w:pPr>
+        <w:tabs>
+          <w:tab w:val="num" w:pos="3600"/>
+        </w:tabs>
+        <w:ind w:left="3600" w:hanging="360"/>
+      </w:pPr>
+      <w:rPr>
+        <w:rFonts w:ascii="Wingdings" w:hAnsi="Wingdings" w:hint="default"/>
+        <w:sz w:val="20"/>
+      </w:rPr>
+    </w:lvl>
+    <w:lvl w:ilvl="5" w:tentative="1">
+      <w:start w:val="1"/>
+      <w:numFmt w:val="bullet"/>
+      <w:lvlText w:val=""/>
+      <w:lvlJc w:val="left"/>
+      <w:pPr>
+        <w:tabs>
+          <w:tab w:val="num" w:pos="4320"/>
+        </w:tabs>
+        <w:ind w:left="4320" w:hanging="360"/>
+      </w:pPr>
+      <w:rPr>
+        <w:rFonts w:ascii="Wingdings" w:hAnsi="Wingdings" w:hint="default"/>
+        <w:sz w:val="20"/>
+      </w:rPr>
+    </w:lvl>
+    <w:lvl w:ilvl="6" w:tentative="1">
+      <w:start w:val="1"/>
+      <w:numFmt w:val="bullet"/>
+      <w:lvlText w:val=""/>
+      <w:lvlJc w:val="left"/>
+      <w:pPr>
+        <w:tabs>
+          <w:tab w:val="num" w:pos="5040"/>
+        </w:tabs>
+        <w:ind w:left="5040" w:hanging="360"/>
+      </w:pPr>
+      <w:rPr>
+        <w:rFonts w:ascii="Wingdings" w:hAnsi="Wingdings" w:hint="default"/>
+        <w:sz w:val="20"/>
+      </w:rPr>
+    </w:lvl>
+    <w:lvl w:ilvl="7" w:tentative="1">
+      <w:start w:val="1"/>
+      <w:numFmt w:val="bullet"/>
+      <w:lvlText w:val=""/>
+      <w:lvlJc w:val="left"/>
+      <w:pPr>
+        <w:tabs>
+          <w:tab w:val="num" w:pos="5760"/>
+        </w:tabs>
+        <w:ind w:left="5760" w:hanging="360"/>
+      </w:pPr>
+      <w:rPr>
+        <w:rFonts w:ascii="Wingdings" w:hAnsi="Wingdings" w:hint="default"/>
+        <w:sz w:val="20"/>
+      </w:rPr>
+    </w:lvl>
+    <w:lvl w:ilvl="8" w:tentative="1">
+      <w:start w:val="1"/>
+      <w:numFmt w:val="bullet"/>
+      <w:lvlText w:val=""/>
+      <w:lvlJc w:val="left"/>
+      <w:pPr>
+        <w:tabs>
+          <w:tab w:val="num" w:pos="6480"/>
+        </w:tabs>
+        <w:ind w:left="6480" w:hanging="360"/>
+      </w:pPr>
+      <w:rPr>
+        <w:rFonts w:ascii="Wingdings" w:hAnsi="Wingdings" w:hint="default"/>
+        <w:sz w:val="20"/>
+      </w:rPr>
+    </w:lvl>
+  </w:abstractNum>
+  <w:abstractNum w:abstractNumId="12" w15:restartNumberingAfterBreak="0">
     <w:nsid w:val="7C5A665E"/>
     <w:multiLevelType w:val="multilevel"/>
     <w:tmpl w:val="DCF2ED22"/>
@@ -1450,16 +3882,314 @@
         </w:tabs>
         <w:ind w:left="6480" w:hanging="720"/>
       </w:pPr>
+    </w:lvl>
+  </w:abstractNum>
+  <w:abstractNum w:abstractNumId="13" w15:restartNumberingAfterBreak="0">
+    <w:nsid w:val="7D0A4295"/>
+    <w:multiLevelType w:val="multilevel"/>
+    <w:tmpl w:val="19E021B6"/>
+    <w:lvl w:ilvl="0">
+      <w:start w:val="1"/>
+      <w:numFmt w:val="bullet"/>
+      <w:lvlText w:val=""/>
+      <w:lvlJc w:val="left"/>
+      <w:pPr>
+        <w:tabs>
+          <w:tab w:val="num" w:pos="720"/>
+        </w:tabs>
+        <w:ind w:left="720" w:hanging="360"/>
+      </w:pPr>
+      <w:rPr>
+        <w:rFonts w:ascii="Symbol" w:hAnsi="Symbol" w:hint="default"/>
+        <w:sz w:val="20"/>
+      </w:rPr>
+    </w:lvl>
+    <w:lvl w:ilvl="1" w:tentative="1">
+      <w:start w:val="1"/>
+      <w:numFmt w:val="bullet"/>
+      <w:lvlText w:val="o"/>
+      <w:lvlJc w:val="left"/>
+      <w:pPr>
+        <w:tabs>
+          <w:tab w:val="num" w:pos="1440"/>
+        </w:tabs>
+        <w:ind w:left="1440" w:hanging="360"/>
+      </w:pPr>
+      <w:rPr>
+        <w:rFonts w:ascii="Courier New" w:hAnsi="Courier New" w:hint="default"/>
+        <w:sz w:val="20"/>
+      </w:rPr>
+    </w:lvl>
+    <w:lvl w:ilvl="2" w:tentative="1">
+      <w:start w:val="1"/>
+      <w:numFmt w:val="bullet"/>
+      <w:lvlText w:val=""/>
+      <w:lvlJc w:val="left"/>
+      <w:pPr>
+        <w:tabs>
+          <w:tab w:val="num" w:pos="2160"/>
+        </w:tabs>
+        <w:ind w:left="2160" w:hanging="360"/>
+      </w:pPr>
+      <w:rPr>
+        <w:rFonts w:ascii="Wingdings" w:hAnsi="Wingdings" w:hint="default"/>
+        <w:sz w:val="20"/>
+      </w:rPr>
+    </w:lvl>
+    <w:lvl w:ilvl="3" w:tentative="1">
+      <w:start w:val="1"/>
+      <w:numFmt w:val="bullet"/>
+      <w:lvlText w:val=""/>
+      <w:lvlJc w:val="left"/>
+      <w:pPr>
+        <w:tabs>
+          <w:tab w:val="num" w:pos="2880"/>
+        </w:tabs>
+        <w:ind w:left="2880" w:hanging="360"/>
+      </w:pPr>
+      <w:rPr>
+        <w:rFonts w:ascii="Wingdings" w:hAnsi="Wingdings" w:hint="default"/>
+        <w:sz w:val="20"/>
+      </w:rPr>
+    </w:lvl>
+    <w:lvl w:ilvl="4" w:tentative="1">
+      <w:start w:val="1"/>
+      <w:numFmt w:val="bullet"/>
+      <w:lvlText w:val=""/>
+      <w:lvlJc w:val="left"/>
+      <w:pPr>
+        <w:tabs>
+          <w:tab w:val="num" w:pos="3600"/>
+        </w:tabs>
+        <w:ind w:left="3600" w:hanging="360"/>
+      </w:pPr>
+      <w:rPr>
+        <w:rFonts w:ascii="Wingdings" w:hAnsi="Wingdings" w:hint="default"/>
+        <w:sz w:val="20"/>
+      </w:rPr>
+    </w:lvl>
+    <w:lvl w:ilvl="5" w:tentative="1">
+      <w:start w:val="1"/>
+      <w:numFmt w:val="bullet"/>
+      <w:lvlText w:val=""/>
+      <w:lvlJc w:val="left"/>
+      <w:pPr>
+        <w:tabs>
+          <w:tab w:val="num" w:pos="4320"/>
+        </w:tabs>
+        <w:ind w:left="4320" w:hanging="360"/>
+      </w:pPr>
+      <w:rPr>
+        <w:rFonts w:ascii="Wingdings" w:hAnsi="Wingdings" w:hint="default"/>
+        <w:sz w:val="20"/>
+      </w:rPr>
+    </w:lvl>
+    <w:lvl w:ilvl="6" w:tentative="1">
+      <w:start w:val="1"/>
+      <w:numFmt w:val="bullet"/>
+      <w:lvlText w:val=""/>
+      <w:lvlJc w:val="left"/>
+      <w:pPr>
+        <w:tabs>
+          <w:tab w:val="num" w:pos="5040"/>
+        </w:tabs>
+        <w:ind w:left="5040" w:hanging="360"/>
+      </w:pPr>
+      <w:rPr>
+        <w:rFonts w:ascii="Wingdings" w:hAnsi="Wingdings" w:hint="default"/>
+        <w:sz w:val="20"/>
+      </w:rPr>
+    </w:lvl>
+    <w:lvl w:ilvl="7" w:tentative="1">
+      <w:start w:val="1"/>
+      <w:numFmt w:val="bullet"/>
+      <w:lvlText w:val=""/>
+      <w:lvlJc w:val="left"/>
+      <w:pPr>
+        <w:tabs>
+          <w:tab w:val="num" w:pos="5760"/>
+        </w:tabs>
+        <w:ind w:left="5760" w:hanging="360"/>
+      </w:pPr>
+      <w:rPr>
+        <w:rFonts w:ascii="Wingdings" w:hAnsi="Wingdings" w:hint="default"/>
+        <w:sz w:val="20"/>
+      </w:rPr>
+    </w:lvl>
+    <w:lvl w:ilvl="8" w:tentative="1">
+      <w:start w:val="1"/>
+      <w:numFmt w:val="bullet"/>
+      <w:lvlText w:val=""/>
+      <w:lvlJc w:val="left"/>
+      <w:pPr>
+        <w:tabs>
+          <w:tab w:val="num" w:pos="6480"/>
+        </w:tabs>
+        <w:ind w:left="6480" w:hanging="360"/>
+      </w:pPr>
+      <w:rPr>
+        <w:rFonts w:ascii="Wingdings" w:hAnsi="Wingdings" w:hint="default"/>
+        <w:sz w:val="20"/>
+      </w:rPr>
+    </w:lvl>
+  </w:abstractNum>
+  <w:abstractNum w:abstractNumId="14" w15:restartNumberingAfterBreak="0">
+    <w:nsid w:val="7E5E3D23"/>
+    <w:multiLevelType w:val="multilevel"/>
+    <w:tmpl w:val="68A637A6"/>
+    <w:lvl w:ilvl="0">
+      <w:start w:val="1"/>
+      <w:numFmt w:val="bullet"/>
+      <w:lvlText w:val=""/>
+      <w:lvlJc w:val="left"/>
+      <w:pPr>
+        <w:tabs>
+          <w:tab w:val="num" w:pos="720"/>
+        </w:tabs>
+        <w:ind w:left="720" w:hanging="360"/>
+      </w:pPr>
+      <w:rPr>
+        <w:rFonts w:ascii="Symbol" w:hAnsi="Symbol" w:hint="default"/>
+        <w:sz w:val="20"/>
+      </w:rPr>
+    </w:lvl>
+    <w:lvl w:ilvl="1" w:tentative="1">
+      <w:start w:val="1"/>
+      <w:numFmt w:val="bullet"/>
+      <w:lvlText w:val="o"/>
+      <w:lvlJc w:val="left"/>
+      <w:pPr>
+        <w:tabs>
+          <w:tab w:val="num" w:pos="1440"/>
+        </w:tabs>
+        <w:ind w:left="1440" w:hanging="360"/>
+      </w:pPr>
+      <w:rPr>
+        <w:rFonts w:ascii="Courier New" w:hAnsi="Courier New" w:hint="default"/>
+        <w:sz w:val="20"/>
+      </w:rPr>
+    </w:lvl>
+    <w:lvl w:ilvl="2" w:tentative="1">
+      <w:start w:val="1"/>
+      <w:numFmt w:val="bullet"/>
+      <w:lvlText w:val=""/>
+      <w:lvlJc w:val="left"/>
+      <w:pPr>
+        <w:tabs>
+          <w:tab w:val="num" w:pos="2160"/>
+        </w:tabs>
+        <w:ind w:left="2160" w:hanging="360"/>
+      </w:pPr>
+      <w:rPr>
+        <w:rFonts w:ascii="Wingdings" w:hAnsi="Wingdings" w:hint="default"/>
+        <w:sz w:val="20"/>
+      </w:rPr>
+    </w:lvl>
+    <w:lvl w:ilvl="3" w:tentative="1">
+      <w:start w:val="1"/>
+      <w:numFmt w:val="bullet"/>
+      <w:lvlText w:val=""/>
+      <w:lvlJc w:val="left"/>
+      <w:pPr>
+        <w:tabs>
+          <w:tab w:val="num" w:pos="2880"/>
+        </w:tabs>
+        <w:ind w:left="2880" w:hanging="360"/>
+      </w:pPr>
+      <w:rPr>
+        <w:rFonts w:ascii="Wingdings" w:hAnsi="Wingdings" w:hint="default"/>
+        <w:sz w:val="20"/>
+      </w:rPr>
+    </w:lvl>
+    <w:lvl w:ilvl="4" w:tentative="1">
+      <w:start w:val="1"/>
+      <w:numFmt w:val="bullet"/>
+      <w:lvlText w:val=""/>
+      <w:lvlJc w:val="left"/>
+      <w:pPr>
+        <w:tabs>
+          <w:tab w:val="num" w:pos="3600"/>
+        </w:tabs>
+        <w:ind w:left="3600" w:hanging="360"/>
+      </w:pPr>
+      <w:rPr>
+        <w:rFonts w:ascii="Wingdings" w:hAnsi="Wingdings" w:hint="default"/>
+        <w:sz w:val="20"/>
+      </w:rPr>
+    </w:lvl>
+    <w:lvl w:ilvl="5" w:tentative="1">
+      <w:start w:val="1"/>
+      <w:numFmt w:val="bullet"/>
+      <w:lvlText w:val=""/>
+      <w:lvlJc w:val="left"/>
+      <w:pPr>
+        <w:tabs>
+          <w:tab w:val="num" w:pos="4320"/>
+        </w:tabs>
+        <w:ind w:left="4320" w:hanging="360"/>
+      </w:pPr>
+      <w:rPr>
+        <w:rFonts w:ascii="Wingdings" w:hAnsi="Wingdings" w:hint="default"/>
+        <w:sz w:val="20"/>
+      </w:rPr>
+    </w:lvl>
+    <w:lvl w:ilvl="6" w:tentative="1">
+      <w:start w:val="1"/>
+      <w:numFmt w:val="bullet"/>
+      <w:lvlText w:val=""/>
+      <w:lvlJc w:val="left"/>
+      <w:pPr>
+        <w:tabs>
+          <w:tab w:val="num" w:pos="5040"/>
+        </w:tabs>
+        <w:ind w:left="5040" w:hanging="360"/>
+      </w:pPr>
+      <w:rPr>
+        <w:rFonts w:ascii="Wingdings" w:hAnsi="Wingdings" w:hint="default"/>
+        <w:sz w:val="20"/>
+      </w:rPr>
+    </w:lvl>
+    <w:lvl w:ilvl="7" w:tentative="1">
+      <w:start w:val="1"/>
+      <w:numFmt w:val="bullet"/>
+      <w:lvlText w:val=""/>
+      <w:lvlJc w:val="left"/>
+      <w:pPr>
+        <w:tabs>
+          <w:tab w:val="num" w:pos="5760"/>
+        </w:tabs>
+        <w:ind w:left="5760" w:hanging="360"/>
+      </w:pPr>
+      <w:rPr>
+        <w:rFonts w:ascii="Wingdings" w:hAnsi="Wingdings" w:hint="default"/>
+        <w:sz w:val="20"/>
+      </w:rPr>
+    </w:lvl>
+    <w:lvl w:ilvl="8" w:tentative="1">
+      <w:start w:val="1"/>
+      <w:numFmt w:val="bullet"/>
+      <w:lvlText w:val=""/>
+      <w:lvlJc w:val="left"/>
+      <w:pPr>
+        <w:tabs>
+          <w:tab w:val="num" w:pos="6480"/>
+        </w:tabs>
+        <w:ind w:left="6480" w:hanging="360"/>
+      </w:pPr>
+      <w:rPr>
+        <w:rFonts w:ascii="Wingdings" w:hAnsi="Wingdings" w:hint="default"/>
+        <w:sz w:val="20"/>
+      </w:rPr>
     </w:lvl>
   </w:abstractNum>
   <w:num w:numId="1" w16cid:durableId="1461537947">
     <w:abstractNumId w:val="2"/>
   </w:num>
   <w:num w:numId="2" w16cid:durableId="1883248899">
-    <w:abstractNumId w:val="5"/>
+    <w:abstractNumId w:val="12"/>
   </w:num>
   <w:num w:numId="3" w16cid:durableId="1370911044">
-    <w:abstractNumId w:val="4"/>
+    <w:abstractNumId w:val="8"/>
   </w:num>
   <w:num w:numId="4" w16cid:durableId="1662854483">
     <w:abstractNumId w:val="3"/>
@@ -1469,6 +4199,33 @@
   </w:num>
   <w:num w:numId="6" w16cid:durableId="1647976416">
     <w:abstractNumId w:val="0"/>
+  </w:num>
+  <w:num w:numId="7" w16cid:durableId="1968969970">
+    <w:abstractNumId w:val="7"/>
+  </w:num>
+  <w:num w:numId="8" w16cid:durableId="316228762">
+    <w:abstractNumId w:val="6"/>
+  </w:num>
+  <w:num w:numId="9" w16cid:durableId="405154599">
+    <w:abstractNumId w:val="14"/>
+  </w:num>
+  <w:num w:numId="10" w16cid:durableId="1907957707">
+    <w:abstractNumId w:val="4"/>
+  </w:num>
+  <w:num w:numId="11" w16cid:durableId="256789960">
+    <w:abstractNumId w:val="11"/>
+  </w:num>
+  <w:num w:numId="12" w16cid:durableId="453790406">
+    <w:abstractNumId w:val="5"/>
+  </w:num>
+  <w:num w:numId="13" w16cid:durableId="448669745">
+    <w:abstractNumId w:val="9"/>
+  </w:num>
+  <w:num w:numId="14" w16cid:durableId="975571474">
+    <w:abstractNumId w:val="10"/>
+  </w:num>
+  <w:num w:numId="15" w16cid:durableId="1206213644">
+    <w:abstractNumId w:val="13"/>
   </w:num>
 </w:numbering>
 </file>
@@ -2082,7 +4839,6 @@
   <w:style w:type="character" w:default="1" w:styleId="Fontepargpadro">
     <w:name w:val="Default Paragraph Font"/>
     <w:uiPriority w:val="1"/>
-    <w:semiHidden/>
     <w:unhideWhenUsed/>
   </w:style>
   <w:style w:type="table" w:default="1" w:styleId="Tabelanormal">

</xml_diff>